<commit_message>
fix(gr): minor changes on the pdf-export
* Remove field "Zuständig" on the front page
* Remove the sections "Bestätigung" and "Einreichen"
</commit_message>
<xml_diff>
--- a/document-merge-service/kt_gr/templatefiles/form.docx
+++ b/document-merge-service/kt_gr/templatefiles/form.docx
@@ -87,7 +87,7 @@
       <w:pPr>
         <w:pStyle w:val="FrameContents"/>
         <w:suppressAutoHyphens w:val="true"/>
-        <w:overflowPunct w:val="true"/>
+        <w:overflowPunct w:val="false"/>
         <w:bidi w:val="0"/>
         <w:spacing w:before="114" w:after="114"/>
         <w:ind w:left="4229" w:right="0" w:hanging="0"/>
@@ -114,7 +114,7 @@
         <w:pStyle w:val="FrameContents"/>
         <w:widowControl w:val="false"/>
         <w:suppressAutoHyphens w:val="true"/>
-        <w:overflowPunct w:val="true"/>
+        <w:overflowPunct w:val="false"/>
         <w:bidi w:val="0"/>
         <w:spacing w:before="114" w:after="114"/>
         <w:ind w:left="4229" w:right="0" w:hanging="0"/>
@@ -141,7 +141,7 @@
         <w:pStyle w:val="FrameContents"/>
         <w:widowControl w:val="false"/>
         <w:suppressAutoHyphens w:val="true"/>
-        <w:overflowPunct w:val="true"/>
+        <w:overflowPunct w:val="false"/>
         <w:bidi w:val="0"/>
         <w:spacing w:before="114" w:after="114"/>
         <w:ind w:left="4229" w:right="0" w:hanging="0"/>
@@ -1117,7 +1117,7 @@
                 <w:szCs w:val="18"/>
                 <w:lang w:val="fr-CH" w:eastAsia="zh-CN" w:bidi="hi-IN"/>
               </w:rPr>
-              <w:t>{{ responsibleHeaderLabel }}</w:t>
+              <w:t>{{ inputDateHeaderLabel }}</w:t>
             </w:r>
           </w:p>
         </w:tc>
@@ -1163,7 +1163,7 @@
               <w:pStyle w:val="Heading3"/>
               <w:widowControl w:val="false"/>
               <w:numPr>
-                <w:ilvl w:val="2"/>
+                <w:ilvl w:val="3"/>
                 <w:numId w:val="3"/>
               </w:numPr>
               <w:suppressAutoHyphens w:val="true"/>
@@ -1175,12 +1175,16 @@
             </w:pPr>
             <w:r>
               <w:rPr>
-                <w:rFonts w:cs="Arial" w:ascii="Arial" w:hAnsi="Arial"/>
-                <w:sz w:val="18"/>
-                <w:szCs w:val="18"/>
-                <w:lang w:val="fr-CH"/>
-              </w:rPr>
-              <w:t>{{ inputDateHeaderLabel }}</w:t>
+                <w:rFonts w:eastAsia="Noto Sans CJK SC Regular" w:cs="Arial" w:ascii="Arial" w:hAnsi="Arial"/>
+                <w:b/>
+                <w:bCs/>
+                <w:color w:val="auto"/>
+                <w:kern w:val="2"/>
+                <w:sz w:val="18"/>
+                <w:szCs w:val="18"/>
+                <w:lang w:val="fr-CH" w:eastAsia="zh-CN" w:bidi="hi-IN"/>
+              </w:rPr>
+              <w:t>{{ descriptionHeaderLabel }}</w:t>
             </w:r>
           </w:p>
         </w:tc>
@@ -1218,7 +1222,7 @@
                 <w:szCs w:val="18"/>
                 <w:lang w:val="fr-CH" w:eastAsia="zh-CN" w:bidi="hi-IN"/>
               </w:rPr>
-              <w:t>{% if responsibleHeader %}{{ responsibleHeader }}{% else %}-{% endif%}</w:t>
+              <w:t>{% if inputDateHeader %}{{ inputDateHeader | date("dd.MM.YYYY") }}{% if paperInputDateHeader %} ({{ paperInputDateHeader | date("dd.MM.YYYY") }}){% else %}{% endif %}{% else %}-{% endif %}</w:t>
             </w:r>
           </w:p>
         </w:tc>
@@ -1285,7 +1289,7 @@
                 <w:szCs w:val="18"/>
                 <w:lang w:val="fr-CH" w:eastAsia="zh-CN" w:bidi="hi-IN"/>
               </w:rPr>
-              <w:t>{% if inputDateHeader %}{{ inputDateHeader | date("dd.MM.YYYY") }}{% if paperInputDateHeader %} ({{ paperInputDateHeader | date("dd.MM.YYYY") }}){% else %}{% endif %}{% else %}-{% endif %}</w:t>
+              <w:t>{% if descriptionHeader %}{{ descriptionHeader }}{% else %}-{% endif%}</w:t>
             </w:r>
           </w:p>
         </w:tc>
@@ -1396,7 +1400,7 @@
               <w:pStyle w:val="Heading3"/>
               <w:widowControl w:val="false"/>
               <w:numPr>
-                <w:ilvl w:val="3"/>
+                <w:ilvl w:val="2"/>
                 <w:numId w:val="3"/>
               </w:numPr>
               <w:suppressAutoHyphens w:val="true"/>
@@ -1417,7 +1421,7 @@
                 <w:szCs w:val="18"/>
                 <w:lang w:val="fr-CH" w:eastAsia="zh-CN" w:bidi="hi-IN"/>
               </w:rPr>
-              <w:t>{{ descriptionHeaderLabel }}</w:t>
+              <w:t>{% if modificationHeader %}{{ modificationHeaderLabel }}{% endif %}</w:t>
             </w:r>
           </w:p>
         </w:tc>
@@ -1469,17 +1473,7 @@
               </w:rPr>
             </w:pPr>
             <w:r>
-              <w:rPr>
-                <w:rFonts w:eastAsia="Noto Sans CJK SC Regular" w:cs="Arial" w:ascii="Arial" w:hAnsi="Arial"/>
-                <w:b/>
-                <w:bCs/>
-                <w:color w:val="auto"/>
-                <w:kern w:val="2"/>
-                <w:sz w:val="18"/>
-                <w:szCs w:val="18"/>
-                <w:lang w:val="fr-CH" w:eastAsia="zh-CN" w:bidi="hi-IN"/>
-              </w:rPr>
-              <w:t>{% if modificationHeader %}{{ modificationHeaderLabel }}{% endif %}</w:t>
+              <w:rPr/>
             </w:r>
           </w:p>
         </w:tc>
@@ -1517,7 +1511,7 @@
                 <w:szCs w:val="18"/>
                 <w:lang w:val="fr-CH" w:eastAsia="zh-CN" w:bidi="hi-IN"/>
               </w:rPr>
-              <w:t>{% if descriptionHeader %}{{ descriptionHeader }}{% else %}-{% endif%}</w:t>
+              <w:t>{% if modificationHeader%}{{ modificationHeader }}{% endif%}</w:t>
             </w:r>
           </w:p>
         </w:tc>
@@ -1569,17 +1563,7 @@
               </w:rPr>
             </w:pPr>
             <w:r>
-              <w:rPr>
-                <w:rFonts w:eastAsia="Noto Sans CJK SC Regular" w:cs="Arial" w:ascii="Arial" w:hAnsi="Arial"/>
-                <w:b w:val="false"/>
-                <w:bCs w:val="false"/>
-                <w:color w:val="auto"/>
-                <w:kern w:val="2"/>
-                <w:sz w:val="18"/>
-                <w:szCs w:val="18"/>
-                <w:lang w:val="fr-CH" w:eastAsia="zh-CN" w:bidi="hi-IN"/>
-              </w:rPr>
-              <w:t>{% if modificationHeader%}{{ modificationHeader }}{% endif%}</w:t>
+              <w:rPr/>
             </w:r>
           </w:p>
         </w:tc>
@@ -2441,7 +2425,6 @@
             </w:r>
             <w:r>
               <w:rPr>
-                <w:rFonts w:ascii="Arial" w:hAnsi="Arial"/>
                 <w:sz w:val="20"/>
               </w:rPr>
               <w:drawing>
@@ -2494,7 +2477,6 @@
             </w:r>
             <w:r>
               <w:rPr>
-                <w:rFonts w:ascii="Arial" w:hAnsi="Arial"/>
                 <w:sz w:val="20"/>
               </w:rPr>
               <w:drawing>
@@ -2634,7 +2616,6 @@
             </w:r>
             <w:r>
               <w:rPr>
-                <w:rFonts w:ascii="Arial" w:hAnsi="Arial"/>
                 <w:sz w:val="20"/>
               </w:rPr>
               <w:drawing>
@@ -2687,7 +2668,6 @@
             </w:r>
             <w:r>
               <w:rPr>
-                <w:rFonts w:ascii="Arial" w:hAnsi="Arial"/>
                 <w:sz w:val="20"/>
               </w:rPr>
               <w:drawing>
@@ -3918,7 +3898,6 @@
             </w:r>
             <w:r>
               <w:rPr>
-                <w:rFonts w:ascii="Arial" w:hAnsi="Arial"/>
                 <w:sz w:val="20"/>
               </w:rPr>
               <w:drawing>
@@ -3970,7 +3949,6 @@
             </w:r>
             <w:r>
               <w:rPr>
-                <w:rFonts w:ascii="Arial" w:hAnsi="Arial"/>
                 <w:sz w:val="20"/>
               </w:rPr>
               <w:drawing>
@@ -4105,7 +4083,6 @@
             </w:r>
             <w:r>
               <w:rPr>
-                <w:rFonts w:ascii="Arial" w:hAnsi="Arial"/>
                 <w:sz w:val="20"/>
               </w:rPr>
               <w:drawing>
@@ -4157,7 +4134,6 @@
             </w:r>
             <w:r>
               <w:rPr>
-                <w:rFonts w:ascii="Arial" w:hAnsi="Arial"/>
                 <w:sz w:val="20"/>
               </w:rPr>
               <w:drawing>
@@ -4977,7 +4953,6 @@
             </w:r>
             <w:r>
               <w:rPr>
-                <w:rFonts w:ascii="Arial" w:hAnsi="Arial"/>
                 <w:sz w:val="20"/>
               </w:rPr>
               <w:drawing>
@@ -5029,7 +5004,6 @@
             </w:r>
             <w:r>
               <w:rPr>
-                <w:rFonts w:ascii="Arial" w:hAnsi="Arial"/>
                 <w:sz w:val="20"/>
               </w:rPr>
               <w:drawing>
@@ -5329,23 +5303,7 @@
         <w:szCs w:val="18"/>
       </w:rPr>
       <w:tab/>
-      <w:t xml:space="preserve">{{ caseType }} – {{ </w:t>
-    </w:r>
-    <w:r>
-      <w:rPr>
-        <w:rFonts w:ascii="Arial" w:hAnsi="Arial"/>
-        <w:sz w:val="18"/>
-        <w:szCs w:val="18"/>
-      </w:rPr>
-      <w:t>dossierNr</w:t>
-    </w:r>
-    <w:r>
-      <w:rPr>
-        <w:rFonts w:ascii="Arial" w:hAnsi="Arial"/>
-        <w:sz w:val="18"/>
-        <w:szCs w:val="18"/>
-      </w:rPr>
-      <w:t xml:space="preserve"> }}</w:t>
+      <w:t>{{ caseType }} – {{ dossierNr }}</w:t>
     </w:r>
   </w:p>
 </w:ftr>
@@ -5382,7 +5340,7 @@
             <v:h position="@0,21600"/>
           </v:handles>
         </v:shapetype>
-        <v:shape id="PowerPlusWaterMarkObject" o:spid="shape_0" fillcolor="silver" stroked="f" o:allowincell="f" style="position:absolute;margin-left:0.3pt;margin-top:308.7pt;width:445.85pt;height:111pt;mso-wrap-style:none;v-text-anchor:middle;rotation:315;mso-position-horizontal:center;mso-position-horizontal-relative:margin;mso-position-vertical:center;mso-position-vertical-relative:margin" type="_x0000_t136">
+        <v:shape id="PowerPlusWaterMarkObject" o:spid="shape_0" fillcolor="silver" stroked="f" o:allowincell="f" style="position:absolute;margin-left:0.3pt;margin-top:308.7pt;width:445.8pt;height:110.95pt;mso-wrap-style:none;v-text-anchor:middle;rotation:315;mso-position-horizontal:center;mso-position-horizontal-relative:margin;mso-position-vertical:center;mso-position-vertical-relative:margin" type="_x0000_t136">
           <v:path textpathok="t"/>
           <v:textpath on="t" fitshape="t" string="{{  draft  }}" trim="t" style="font-family:&quot;Arial&quot;;font-size:1pt"/>
           <v:fill o:detectmouseclick="t" type="solid" color2="#3f3f3f" opacity="0.5"/>

</xml_diff>

<commit_message>
fix(gr): remove the watermark in the form template
</commit_message>
<xml_diff>
--- a/document-merge-service/kt_gr/templatefiles/form.docx
+++ b/document-merge-service/kt_gr/templatefiles/form.docx
@@ -87,7 +87,7 @@
       <w:pPr>
         <w:pStyle w:val="FrameContents"/>
         <w:suppressAutoHyphens w:val="true"/>
-        <w:overflowPunct w:val="false"/>
+        <w:overflowPunct w:val="true"/>
         <w:bidi w:val="0"/>
         <w:spacing w:before="114" w:after="114"/>
         <w:ind w:left="4229" w:right="0" w:hanging="0"/>
@@ -114,7 +114,7 @@
         <w:pStyle w:val="FrameContents"/>
         <w:widowControl w:val="false"/>
         <w:suppressAutoHyphens w:val="true"/>
-        <w:overflowPunct w:val="false"/>
+        <w:overflowPunct w:val="true"/>
         <w:bidi w:val="0"/>
         <w:spacing w:before="114" w:after="114"/>
         <w:ind w:left="4229" w:right="0" w:hanging="0"/>
@@ -141,7 +141,7 @@
         <w:pStyle w:val="FrameContents"/>
         <w:widowControl w:val="false"/>
         <w:suppressAutoHyphens w:val="true"/>
-        <w:overflowPunct w:val="false"/>
+        <w:overflowPunct w:val="true"/>
         <w:bidi w:val="0"/>
         <w:spacing w:before="114" w:after="114"/>
         <w:ind w:left="4229" w:right="0" w:hanging="0"/>
@@ -1473,7 +1473,9 @@
               </w:rPr>
             </w:pPr>
             <w:r>
-              <w:rPr/>
+              <w:rPr>
+                <w:rFonts w:ascii="Arial" w:hAnsi="Arial"/>
+              </w:rPr>
             </w:r>
           </w:p>
         </w:tc>
@@ -1563,7 +1565,9 @@
               </w:rPr>
             </w:pPr>
             <w:r>
-              <w:rPr/>
+              <w:rPr>
+                <w:rFonts w:ascii="Arial" w:hAnsi="Arial"/>
+              </w:rPr>
             </w:r>
           </w:p>
         </w:tc>
@@ -5318,36 +5322,6 @@
     </w:pPr>
     <w:r>
       <w:rPr/>
-      <w:pict>
-        <v:shapetype id="_x0000_t136" coordsize="21600,21600" o:spt="136" adj="10800" path="m@9,l@10,em@11,21600l@12,21600e">
-          <v:stroke joinstyle="miter"/>
-          <v:formulas>
-            <v:f eqn="val #0"/>
-            <v:f eqn="sum @0 0 10800"/>
-            <v:f eqn="sum @0 0 0"/>
-            <v:f eqn="sum width 0 @0"/>
-            <v:f eqn="prod @2 2 1"/>
-            <v:f eqn="prod @3 2 1"/>
-            <v:f eqn="if @1 @5 @4"/>
-            <v:f eqn="sum 0 @6 0"/>
-            <v:f eqn="sum width 0 @6"/>
-            <v:f eqn="if @1 0 @8"/>
-            <v:f eqn="if @1 @7 width"/>
-            <v:f eqn="if @1 @8 0"/>
-            <v:f eqn="if @1 width @7"/>
-          </v:formulas>
-          <v:handles>
-            <v:h position="@0,21600"/>
-          </v:handles>
-        </v:shapetype>
-        <v:shape id="PowerPlusWaterMarkObject" o:spid="shape_0" fillcolor="silver" stroked="f" o:allowincell="f" style="position:absolute;margin-left:0.3pt;margin-top:308.7pt;width:445.8pt;height:110.95pt;mso-wrap-style:none;v-text-anchor:middle;rotation:315;mso-position-horizontal:center;mso-position-horizontal-relative:margin;mso-position-vertical:center;mso-position-vertical-relative:margin" type="_x0000_t136">
-          <v:path textpathok="t"/>
-          <v:textpath on="t" fitshape="t" string="{{  draft  }}" trim="t" style="font-family:&quot;Arial&quot;;font-size:1pt"/>
-          <v:fill o:detectmouseclick="t" type="solid" color2="#3f3f3f" opacity="0.5"/>
-          <v:stroke color="#3465a4" joinstyle="round" endcap="flat"/>
-          <w10:wrap type="none"/>
-        </v:shape>
-      </w:pict>
     </w:r>
   </w:p>
 </w:hdr>

</xml_diff>

<commit_message>
feat(gr): PDF Formulars mit Situationsplan
</commit_message>
<xml_diff>
--- a/document-merge-service/kt_gr/templatefiles/form.docx
+++ b/document-merge-service/kt_gr/templatefiles/form.docx
@@ -9,7 +9,7 @@
         <w:suppressAutoHyphens w:val="true"/>
         <w:bidi w:val="0"/>
         <w:spacing w:before="0" w:after="0"/>
-        <w:ind w:left="4229" w:right="0" w:hanging="0"/>
+        <w:ind w:hanging="0" w:left="4229" w:right="0"/>
         <w:jc w:val="left"/>
         <w:rPr>
           <w:rFonts w:ascii="Arial" w:hAnsi="Arial" w:cs="Arial"/>
@@ -30,7 +30,7 @@
         <w:suppressAutoHyphens w:val="true"/>
         <w:bidi w:val="0"/>
         <w:spacing w:before="0" w:after="0"/>
-        <w:ind w:left="4229" w:right="0" w:hanging="0"/>
+        <w:ind w:hanging="0" w:left="4229" w:right="0"/>
         <w:jc w:val="left"/>
         <w:rPr>
           <w:rFonts w:ascii="Arial" w:hAnsi="Arial"/>
@@ -90,7 +90,7 @@
         <w:overflowPunct w:val="true"/>
         <w:bidi w:val="0"/>
         <w:spacing w:before="114" w:after="114"/>
-        <w:ind w:left="4229" w:right="0" w:hanging="0"/>
+        <w:ind w:hanging="0" w:left="4229" w:right="0"/>
         <w:jc w:val="left"/>
         <w:rPr>
           <w:rFonts w:ascii="Arial" w:hAnsi="Arial"/>
@@ -117,7 +117,7 @@
         <w:overflowPunct w:val="true"/>
         <w:bidi w:val="0"/>
         <w:spacing w:before="114" w:after="114"/>
-        <w:ind w:left="4229" w:right="0" w:hanging="0"/>
+        <w:ind w:hanging="0" w:left="4229" w:right="0"/>
         <w:jc w:val="left"/>
         <w:rPr>
           <w:rFonts w:ascii="Arial" w:hAnsi="Arial"/>
@@ -144,7 +144,7 @@
         <w:overflowPunct w:val="true"/>
         <w:bidi w:val="0"/>
         <w:spacing w:before="114" w:after="114"/>
-        <w:ind w:left="4229" w:right="0" w:hanging="0"/>
+        <w:ind w:hanging="0" w:left="4229" w:right="0"/>
         <w:jc w:val="left"/>
         <w:rPr>
           <w:rFonts w:ascii="Arial" w:hAnsi="Arial"/>
@@ -170,7 +170,7 @@
         <w:suppressAutoHyphens w:val="true"/>
         <w:bidi w:val="0"/>
         <w:spacing w:before="0" w:after="15"/>
-        <w:ind w:left="4229" w:right="0" w:hanging="0"/>
+        <w:ind w:hanging="0" w:left="4229" w:right="0"/>
         <w:jc w:val="left"/>
         <w:rPr>
           <w:rFonts w:ascii="Arial" w:hAnsi="Arial"/>
@@ -217,7 +217,7 @@
               </w:numPr>
               <w:suppressAutoHyphens w:val="true"/>
               <w:spacing w:before="0" w:after="0"/>
-              <w:ind w:right="176" w:hanging="0"/>
+              <w:ind w:hanging="0" w:right="176"/>
               <w:rPr>
                 <w:rFonts w:ascii="Arial" w:hAnsi="Arial"/>
               </w:rPr>
@@ -248,7 +248,7 @@
               </w:numPr>
               <w:suppressAutoHyphens w:val="true"/>
               <w:spacing w:before="0" w:after="0"/>
-              <w:ind w:right="176" w:hanging="0"/>
+              <w:ind w:hanging="0" w:right="176"/>
               <w:rPr>
                 <w:rFonts w:ascii="Arial" w:hAnsi="Arial"/>
               </w:rPr>
@@ -275,7 +275,7 @@
               </w:numPr>
               <w:suppressAutoHyphens w:val="true"/>
               <w:spacing w:before="0" w:after="0"/>
-              <w:ind w:right="176" w:hanging="0"/>
+              <w:ind w:hanging="0" w:right="176"/>
               <w:rPr>
                 <w:rFonts w:ascii="Arial" w:hAnsi="Arial"/>
               </w:rPr>
@@ -334,7 +334,6 @@
               <w:rPr>
                 <w:rFonts w:ascii="Arial" w:hAnsi="Arial" w:eastAsia="Noto Sans CJK SC Regular" w:cs="Arial"/>
                 <w:b w:val="false"/>
-                <w:b w:val="false"/>
                 <w:bCs w:val="false"/>
                 <w:color w:val="auto"/>
                 <w:kern w:val="2"/>
@@ -400,7 +399,6 @@
               <w:rPr>
                 <w:rFonts w:ascii="Arial" w:hAnsi="Arial" w:eastAsia="Noto Sans CJK SC Regular" w:cs="Arial"/>
                 <w:b w:val="false"/>
-                <w:b w:val="false"/>
                 <w:bCs w:val="false"/>
                 <w:color w:val="auto"/>
                 <w:kern w:val="2"/>
@@ -434,7 +432,6 @@
               <w:widowControl w:val="false"/>
               <w:rPr>
                 <w:rFonts w:ascii="Arial" w:hAnsi="Arial" w:eastAsia="Noto Sans CJK SC Regular" w:cs="Arial"/>
-                <w:b w:val="false"/>
                 <w:b w:val="false"/>
                 <w:bCs w:val="false"/>
                 <w:color w:val="auto"/>
@@ -496,7 +493,7 @@
               </w:numPr>
               <w:suppressAutoHyphens w:val="true"/>
               <w:spacing w:before="0" w:after="0"/>
-              <w:ind w:right="176" w:hanging="0"/>
+              <w:ind w:hanging="0" w:right="176"/>
               <w:rPr>
                 <w:rFonts w:ascii="Arial" w:hAnsi="Arial"/>
               </w:rPr>
@@ -531,7 +528,7 @@
               </w:numPr>
               <w:suppressAutoHyphens w:val="true"/>
               <w:spacing w:before="0" w:after="0"/>
-              <w:ind w:right="176" w:hanging="0"/>
+              <w:ind w:hanging="0" w:right="176"/>
               <w:rPr>
                 <w:rFonts w:ascii="Arial" w:hAnsi="Arial"/>
               </w:rPr>
@@ -558,7 +555,7 @@
               </w:numPr>
               <w:suppressAutoHyphens w:val="true"/>
               <w:spacing w:before="0" w:after="0"/>
-              <w:ind w:right="176" w:hanging="0"/>
+              <w:ind w:hanging="0" w:right="176"/>
               <w:rPr>
                 <w:rFonts w:ascii="Arial" w:hAnsi="Arial"/>
               </w:rPr>
@@ -624,10 +621,9 @@
               </w:numPr>
               <w:suppressAutoHyphens w:val="true"/>
               <w:spacing w:before="0" w:after="0"/>
-              <w:ind w:right="176" w:hanging="0"/>
-              <w:rPr>
-                <w:rFonts w:ascii="Arial" w:hAnsi="Arial"/>
-                <w:b w:val="false"/>
+              <w:ind w:hanging="0" w:right="176"/>
+              <w:rPr>
+                <w:rFonts w:ascii="Arial" w:hAnsi="Arial"/>
                 <w:b w:val="false"/>
                 <w:bCs w:val="false"/>
               </w:rPr>
@@ -687,10 +683,9 @@
               </w:numPr>
               <w:suppressAutoHyphens w:val="true"/>
               <w:spacing w:before="0" w:after="0"/>
-              <w:ind w:right="176" w:hanging="0"/>
-              <w:rPr>
-                <w:rFonts w:ascii="Arial" w:hAnsi="Arial"/>
-                <w:b w:val="false"/>
+              <w:ind w:hanging="0" w:right="176"/>
+              <w:rPr>
+                <w:rFonts w:ascii="Arial" w:hAnsi="Arial"/>
                 <w:b w:val="false"/>
                 <w:bCs w:val="false"/>
               </w:rPr>
@@ -719,10 +714,9 @@
               </w:numPr>
               <w:suppressAutoHyphens w:val="true"/>
               <w:spacing w:before="0" w:after="0"/>
-              <w:ind w:right="176" w:hanging="0"/>
-              <w:rPr>
-                <w:rFonts w:ascii="Arial" w:hAnsi="Arial"/>
-                <w:b w:val="false"/>
+              <w:ind w:hanging="0" w:right="176"/>
+              <w:rPr>
+                <w:rFonts w:ascii="Arial" w:hAnsi="Arial"/>
                 <w:b w:val="false"/>
                 <w:bCs w:val="false"/>
               </w:rPr>
@@ -751,7 +745,7 @@
               </w:numPr>
               <w:suppressAutoHyphens w:val="true"/>
               <w:spacing w:before="0" w:after="0"/>
-              <w:ind w:right="176" w:hanging="0"/>
+              <w:ind w:hanging="0" w:right="176"/>
               <w:rPr>
                 <w:rFonts w:ascii="Arial" w:hAnsi="Arial"/>
               </w:rPr>
@@ -781,7 +775,7 @@
               </w:numPr>
               <w:suppressAutoHyphens w:val="true"/>
               <w:spacing w:before="0" w:after="0"/>
-              <w:ind w:right="176" w:hanging="0"/>
+              <w:ind w:hanging="0" w:right="176"/>
               <w:rPr>
                 <w:rFonts w:ascii="Arial" w:hAnsi="Arial"/>
               </w:rPr>
@@ -812,10 +806,9 @@
               </w:numPr>
               <w:suppressAutoHyphens w:val="true"/>
               <w:spacing w:before="0" w:after="0"/>
-              <w:ind w:right="176" w:hanging="0"/>
-              <w:rPr>
-                <w:rFonts w:ascii="Arial" w:hAnsi="Arial"/>
-                <w:b w:val="false"/>
+              <w:ind w:hanging="0" w:right="176"/>
+              <w:rPr>
+                <w:rFonts w:ascii="Arial" w:hAnsi="Arial"/>
                 <w:b w:val="false"/>
                 <w:bCs w:val="false"/>
               </w:rPr>
@@ -844,7 +837,7 @@
               </w:numPr>
               <w:suppressAutoHyphens w:val="true"/>
               <w:spacing w:before="0" w:after="0"/>
-              <w:ind w:right="176" w:hanging="0"/>
+              <w:ind w:hanging="0" w:right="176"/>
               <w:rPr>
                 <w:rFonts w:ascii="Arial" w:hAnsi="Arial"/>
               </w:rPr>
@@ -878,7 +871,7 @@
               </w:numPr>
               <w:suppressAutoHyphens w:val="true"/>
               <w:spacing w:before="0" w:after="0"/>
-              <w:ind w:right="176" w:hanging="0"/>
+              <w:ind w:hanging="0" w:right="176"/>
               <w:rPr>
                 <w:rFonts w:ascii="Arial" w:hAnsi="Arial"/>
               </w:rPr>
@@ -937,10 +930,9 @@
               </w:numPr>
               <w:suppressAutoHyphens w:val="true"/>
               <w:spacing w:before="0" w:after="0"/>
-              <w:ind w:right="176" w:hanging="0"/>
-              <w:rPr>
-                <w:rFonts w:ascii="Arial" w:hAnsi="Arial"/>
-                <w:b w:val="false"/>
+              <w:ind w:hanging="0" w:right="176"/>
+              <w:rPr>
+                <w:rFonts w:ascii="Arial" w:hAnsi="Arial"/>
                 <w:b w:val="false"/>
                 <w:bCs w:val="false"/>
               </w:rPr>
@@ -969,7 +961,7 @@
               </w:numPr>
               <w:suppressAutoHyphens w:val="true"/>
               <w:spacing w:before="0" w:after="0"/>
-              <w:ind w:right="176" w:hanging="0"/>
+              <w:ind w:hanging="0" w:right="176"/>
               <w:rPr>
                 <w:rFonts w:ascii="Arial" w:hAnsi="Arial"/>
               </w:rPr>
@@ -1007,10 +999,9 @@
               </w:numPr>
               <w:suppressAutoHyphens w:val="true"/>
               <w:spacing w:before="0" w:after="0"/>
-              <w:ind w:right="176" w:hanging="0"/>
-              <w:rPr>
-                <w:rFonts w:ascii="Arial" w:hAnsi="Arial"/>
-                <w:b w:val="false"/>
+              <w:ind w:hanging="0" w:right="176"/>
+              <w:rPr>
+                <w:rFonts w:ascii="Arial" w:hAnsi="Arial"/>
                 <w:b w:val="false"/>
                 <w:bCs w:val="false"/>
               </w:rPr>
@@ -1039,10 +1030,9 @@
               </w:numPr>
               <w:suppressAutoHyphens w:val="true"/>
               <w:spacing w:before="0" w:after="0"/>
-              <w:ind w:right="176" w:hanging="0"/>
-              <w:rPr>
-                <w:rFonts w:ascii="Arial" w:hAnsi="Arial"/>
-                <w:b w:val="false"/>
+              <w:ind w:hanging="0" w:right="176"/>
+              <w:rPr>
+                <w:rFonts w:ascii="Arial" w:hAnsi="Arial"/>
                 <w:b w:val="false"/>
                 <w:bCs w:val="false"/>
               </w:rPr>
@@ -1071,7 +1061,7 @@
               </w:numPr>
               <w:suppressAutoHyphens w:val="true"/>
               <w:spacing w:before="0" w:after="0"/>
-              <w:ind w:right="176" w:hanging="0"/>
+              <w:ind w:hanging="0" w:right="176"/>
               <w:rPr>
                 <w:rFonts w:ascii="Arial" w:hAnsi="Arial"/>
               </w:rPr>
@@ -1101,7 +1091,7 @@
               </w:numPr>
               <w:suppressAutoHyphens w:val="true"/>
               <w:spacing w:before="0" w:after="0"/>
-              <w:ind w:right="176" w:hanging="0"/>
+              <w:ind w:hanging="0" w:right="176"/>
               <w:rPr>
                 <w:rFonts w:ascii="Arial" w:hAnsi="Arial"/>
               </w:rPr>
@@ -1136,10 +1126,9 @@
               </w:numPr>
               <w:suppressAutoHyphens w:val="true"/>
               <w:spacing w:before="0" w:after="0"/>
-              <w:ind w:right="176" w:hanging="0"/>
-              <w:rPr>
-                <w:rFonts w:ascii="Arial" w:hAnsi="Arial"/>
-                <w:b w:val="false"/>
+              <w:ind w:hanging="0" w:right="176"/>
+              <w:rPr>
+                <w:rFonts w:ascii="Arial" w:hAnsi="Arial"/>
                 <w:b w:val="false"/>
                 <w:bCs w:val="false"/>
               </w:rPr>
@@ -1168,7 +1157,7 @@
               </w:numPr>
               <w:suppressAutoHyphens w:val="true"/>
               <w:spacing w:before="0" w:after="0"/>
-              <w:ind w:right="176" w:hanging="0"/>
+              <w:ind w:hanging="0" w:right="176"/>
               <w:rPr>
                 <w:rFonts w:ascii="Arial" w:hAnsi="Arial"/>
               </w:rPr>
@@ -1206,7 +1195,7 @@
               </w:numPr>
               <w:suppressAutoHyphens w:val="true"/>
               <w:spacing w:before="0" w:after="0"/>
-              <w:ind w:right="176" w:hanging="0"/>
+              <w:ind w:hanging="0" w:right="176"/>
               <w:rPr>
                 <w:rFonts w:ascii="Arial" w:hAnsi="Arial"/>
               </w:rPr>
@@ -1241,10 +1230,9 @@
               </w:numPr>
               <w:suppressAutoHyphens w:val="true"/>
               <w:spacing w:before="0" w:after="0"/>
-              <w:ind w:right="176" w:hanging="0"/>
-              <w:rPr>
-                <w:rFonts w:ascii="Arial" w:hAnsi="Arial"/>
-                <w:b w:val="false"/>
+              <w:ind w:hanging="0" w:right="176"/>
+              <w:rPr>
+                <w:rFonts w:ascii="Arial" w:hAnsi="Arial"/>
                 <w:b w:val="false"/>
                 <w:bCs w:val="false"/>
               </w:rPr>
@@ -1273,7 +1261,7 @@
               </w:numPr>
               <w:suppressAutoHyphens w:val="true"/>
               <w:spacing w:before="0" w:after="0"/>
-              <w:ind w:right="176" w:hanging="0"/>
+              <w:ind w:hanging="0" w:right="176"/>
               <w:rPr>
                 <w:rFonts w:ascii="Arial" w:hAnsi="Arial"/>
               </w:rPr>
@@ -1311,10 +1299,9 @@
               </w:numPr>
               <w:suppressAutoHyphens w:val="true"/>
               <w:spacing w:before="0" w:after="0"/>
-              <w:ind w:right="176" w:hanging="0"/>
-              <w:rPr>
-                <w:rFonts w:ascii="Arial" w:hAnsi="Arial"/>
-                <w:b w:val="false"/>
+              <w:ind w:hanging="0" w:right="176"/>
+              <w:rPr>
+                <w:rFonts w:ascii="Arial" w:hAnsi="Arial"/>
                 <w:b w:val="false"/>
                 <w:bCs w:val="false"/>
               </w:rPr>
@@ -1343,10 +1330,9 @@
               </w:numPr>
               <w:suppressAutoHyphens w:val="true"/>
               <w:spacing w:before="0" w:after="0"/>
-              <w:ind w:right="176" w:hanging="0"/>
-              <w:rPr>
-                <w:rFonts w:ascii="Arial" w:hAnsi="Arial"/>
-                <w:b w:val="false"/>
+              <w:ind w:hanging="0" w:right="176"/>
+              <w:rPr>
+                <w:rFonts w:ascii="Arial" w:hAnsi="Arial"/>
                 <w:b w:val="false"/>
                 <w:bCs w:val="false"/>
               </w:rPr>
@@ -1375,7 +1361,7 @@
               </w:numPr>
               <w:suppressAutoHyphens w:val="true"/>
               <w:spacing w:before="0" w:after="0"/>
-              <w:ind w:right="176" w:hanging="0"/>
+              <w:ind w:hanging="0" w:right="176"/>
               <w:rPr>
                 <w:rFonts w:ascii="Arial" w:hAnsi="Arial"/>
               </w:rPr>
@@ -1405,7 +1391,7 @@
               </w:numPr>
               <w:suppressAutoHyphens w:val="true"/>
               <w:spacing w:before="0" w:after="0"/>
-              <w:ind w:right="176" w:hanging="0"/>
+              <w:ind w:hanging="0" w:right="176"/>
               <w:rPr>
                 <w:rFonts w:ascii="Arial" w:hAnsi="Arial"/>
               </w:rPr>
@@ -1440,7 +1426,7 @@
               </w:numPr>
               <w:suppressAutoHyphens w:val="true"/>
               <w:spacing w:before="0" w:after="0"/>
-              <w:ind w:right="176" w:hanging="0"/>
+              <w:ind w:hanging="0" w:right="176"/>
               <w:rPr>
                 <w:rFonts w:ascii="Arial" w:hAnsi="Arial"/>
               </w:rPr>
@@ -1467,7 +1453,7 @@
               </w:numPr>
               <w:suppressAutoHyphens w:val="true"/>
               <w:spacing w:before="0" w:after="0"/>
-              <w:ind w:right="176" w:hanging="0"/>
+              <w:ind w:hanging="0" w:right="176"/>
               <w:rPr>
                 <w:rFonts w:ascii="Arial" w:hAnsi="Arial"/>
               </w:rPr>
@@ -1497,7 +1483,7 @@
               </w:numPr>
               <w:suppressAutoHyphens w:val="true"/>
               <w:spacing w:before="0" w:after="0"/>
-              <w:ind w:right="176" w:hanging="0"/>
+              <w:ind w:hanging="0" w:right="176"/>
               <w:rPr>
                 <w:rFonts w:ascii="Arial" w:hAnsi="Arial"/>
               </w:rPr>
@@ -1532,7 +1518,7 @@
               </w:numPr>
               <w:suppressAutoHyphens w:val="true"/>
               <w:spacing w:before="0" w:after="0"/>
-              <w:ind w:right="176" w:hanging="0"/>
+              <w:ind w:hanging="0" w:right="176"/>
               <w:rPr>
                 <w:rFonts w:ascii="Arial" w:hAnsi="Arial"/>
               </w:rPr>
@@ -1559,7 +1545,7 @@
               </w:numPr>
               <w:suppressAutoHyphens w:val="true"/>
               <w:spacing w:before="0" w:after="0"/>
-              <w:ind w:right="176" w:hanging="0"/>
+              <w:ind w:hanging="0" w:right="176"/>
               <w:rPr>
                 <w:rFonts w:ascii="Arial" w:hAnsi="Arial"/>
               </w:rPr>
@@ -1576,24 +1562,43 @@
     <w:p>
       <w:pPr>
         <w:pStyle w:val="Normal"/>
-        <w:widowControl w:val="false"/>
-        <w:suppressAutoHyphens w:val="true"/>
         <w:rPr>
-          <w:rFonts w:ascii="Liberation Sans" w:hAnsi="Liberation Sans" w:cs="Arial"/>
-          <w:color w:val="C0504D" w:themeColor="accent2"/>
-          <w:sz w:val="18"/>
-          <w:szCs w:val="18"/>
           <w:lang w:val="fr-CH"/>
         </w:rPr>
       </w:pPr>
       <w:r>
         <w:rPr>
-          <w:rFonts w:cs="Arial" w:ascii="Liberation Sans" w:hAnsi="Liberation Sans"/>
-          <w:color w:val="C0504D" w:themeColor="accent2"/>
-          <w:sz w:val="18"/>
-          <w:szCs w:val="18"/>
           <w:lang w:val="fr-CH"/>
         </w:rPr>
+        <w:t>{%p if situationsplan %}</w:t>
+      </w:r>
+    </w:p>
+    <w:p>
+      <w:pPr>
+        <w:pStyle w:val="Normal"/>
+        <w:rPr>
+          <w:lang w:val="fr-CH"/>
+        </w:rPr>
+      </w:pPr>
+      <w:r>
+        <w:rPr>
+          <w:lang w:val="fr-CH"/>
+        </w:rPr>
+        <w:t>{{ "situationsplan" | image(135, 78, True) }}</w:t>
+      </w:r>
+    </w:p>
+    <w:p>
+      <w:pPr>
+        <w:pStyle w:val="Normal"/>
+        <w:rPr>
+          <w:lang w:val="fr-CH"/>
+        </w:rPr>
+      </w:pPr>
+      <w:r>
+        <w:rPr>
+          <w:lang w:val="fr-CH"/>
+        </w:rPr>
+        <w:t>{%p endif %}</w:t>
       </w:r>
       <w:r>
         <w:br w:type="page"/>
@@ -1604,6 +1609,7 @@
         <w:pStyle w:val="Normal"/>
         <w:widowControl w:val="false"/>
         <w:suppressAutoHyphens w:val="true"/>
+        <w:spacing w:before="0" w:after="0"/>
         <w:rPr>
           <w:rFonts w:ascii="Arial" w:hAnsi="Arial"/>
         </w:rPr>
@@ -1611,7 +1617,7 @@
       <w:r>
         <w:rPr>
           <w:rFonts w:cs="Arial" w:ascii="Arial" w:hAnsi="Arial"/>
-          <w:color w:val="C0504D" w:themeColor="accent2"/>
+          <w:color w:themeColor="accent2" w:val="C0504D"/>
           <w:sz w:val="18"/>
           <w:szCs w:val="18"/>
           <w:lang w:val="fr-CH"/>
@@ -1631,7 +1637,7 @@
       <w:r>
         <w:rPr>
           <w:rFonts w:cs="Arial" w:ascii="Arial" w:hAnsi="Arial"/>
-          <w:color w:val="4F81BD" w:themeColor="accent1"/>
+          <w:color w:themeColor="accent1" w:val="4F81BD"/>
           <w:sz w:val="18"/>
           <w:szCs w:val="18"/>
           <w:lang w:val="fr-CH"/>
@@ -1643,7 +1649,7 @@
       <w:r>
         <w:rPr>
           <w:rFonts w:cs="Arial" w:ascii="Arial" w:hAnsi="Arial"/>
-          <w:color w:val="4F81BD" w:themeColor="accent1"/>
+          <w:color w:themeColor="accent1" w:val="4F81BD"/>
           <w:sz w:val="18"/>
           <w:szCs w:val="18"/>
           <w:lang w:val="fr-CH"/>
@@ -1657,7 +1663,7 @@
           <w:i w:val="false"/>
           <w:caps w:val="false"/>
           <w:smallCaps w:val="false"/>
-          <w:color w:val="4F81BD" w:themeColor="accent1"/>
+          <w:color w:themeColor="accent1" w:val="4F81BD"/>
           <w:spacing w:val="0"/>
           <w:sz w:val="18"/>
           <w:szCs w:val="18"/>
@@ -1668,7 +1674,7 @@
       <w:r>
         <w:rPr>
           <w:rFonts w:cs="Arial" w:ascii="Arial" w:hAnsi="Arial"/>
-          <w:color w:val="4F81BD" w:themeColor="accent1"/>
+          <w:color w:themeColor="accent1" w:val="4F81BD"/>
           <w:sz w:val="18"/>
           <w:szCs w:val="18"/>
           <w:lang w:val="fr-CH"/>
@@ -1682,7 +1688,7 @@
           <w:i w:val="false"/>
           <w:caps w:val="false"/>
           <w:smallCaps w:val="false"/>
-          <w:color w:val="4F81BD" w:themeColor="accent1"/>
+          <w:color w:themeColor="accent1" w:val="4F81BD"/>
           <w:spacing w:val="0"/>
           <w:sz w:val="18"/>
           <w:szCs w:val="18"/>
@@ -1693,7 +1699,7 @@
       <w:r>
         <w:rPr>
           <w:rFonts w:cs="Arial" w:ascii="Arial" w:hAnsi="Arial"/>
-          <w:color w:val="4F81BD" w:themeColor="accent1"/>
+          <w:color w:themeColor="accent1" w:val="4F81BD"/>
           <w:sz w:val="18"/>
           <w:szCs w:val="18"/>
           <w:lang w:val="fr-CH"/>
@@ -1707,7 +1713,7 @@
           <w:i w:val="false"/>
           <w:caps w:val="false"/>
           <w:smallCaps w:val="false"/>
-          <w:color w:val="4F81BD" w:themeColor="accent1"/>
+          <w:color w:themeColor="accent1" w:val="4F81BD"/>
           <w:spacing w:val="0"/>
           <w:sz w:val="18"/>
           <w:szCs w:val="18"/>
@@ -1718,7 +1724,7 @@
       <w:r>
         <w:rPr>
           <w:rFonts w:cs="Arial" w:ascii="Arial" w:hAnsi="Arial"/>
-          <w:color w:val="4F81BD" w:themeColor="accent1"/>
+          <w:color w:themeColor="accent1" w:val="4F81BD"/>
           <w:sz w:val="18"/>
           <w:szCs w:val="18"/>
           <w:lang w:val="fr-CH"/>
@@ -1738,7 +1744,7 @@
       <w:r>
         <w:rPr>
           <w:rFonts w:cs="Arial" w:ascii="Arial" w:hAnsi="Arial"/>
-          <w:color w:val="4F81BD" w:themeColor="accent1"/>
+          <w:color w:themeColor="accent1" w:val="4F81BD"/>
           <w:sz w:val="18"/>
           <w:szCs w:val="18"/>
           <w:lang w:val="fr-CH"/>
@@ -1758,7 +1764,7 @@
       <w:r>
         <w:rPr>
           <w:rFonts w:cs="Arial" w:ascii="Arial" w:hAnsi="Arial"/>
-          <w:color w:val="4F81BD" w:themeColor="accent1"/>
+          <w:color w:themeColor="accent1" w:val="4F81BD"/>
           <w:sz w:val="18"/>
           <w:szCs w:val="18"/>
           <w:lang w:val="fr-CH"/>
@@ -1796,7 +1802,7 @@
       <w:r>
         <w:rPr>
           <w:rFonts w:cs="Arial" w:ascii="Arial" w:hAnsi="Arial"/>
-          <w:color w:val="C0504D" w:themeColor="accent2"/>
+          <w:color w:themeColor="accent2" w:val="C0504D"/>
           <w:sz w:val="18"/>
           <w:szCs w:val="18"/>
           <w:lang w:val="fr-CH"/>
@@ -1850,7 +1856,7 @@
             <w:r>
               <w:rPr>
                 <w:rFonts w:cs="Arial" w:ascii="Arial" w:hAnsi="Arial"/>
-                <w:color w:val="4F81BD" w:themeColor="accent1"/>
+                <w:color w:themeColor="accent1" w:val="4F81BD"/>
                 <w:sz w:val="18"/>
                 <w:szCs w:val="18"/>
                 <w:lang w:val="fr-CH"/>
@@ -1925,7 +1931,6 @@
               <w:rPr>
                 <w:rFonts w:ascii="Arial" w:hAnsi="Arial" w:eastAsia="Noto Sans CJK SC Regular" w:cs="Arial"/>
                 <w:b/>
-                <w:b/>
                 <w:bCs/>
                 <w:color w:val="auto"/>
                 <w:kern w:val="2"/>
@@ -1976,7 +1981,7 @@
             <w:r>
               <w:rPr>
                 <w:rFonts w:eastAsia="Noto Sans CJK SC Regular" w:cs="Arial" w:ascii="Arial" w:hAnsi="Arial"/>
-                <w:color w:val="4F81BD" w:themeColor="accent1"/>
+                <w:color w:themeColor="accent1" w:val="4F81BD"/>
                 <w:kern w:val="2"/>
                 <w:sz w:val="18"/>
                 <w:szCs w:val="18"/>
@@ -2014,7 +2019,7 @@
             <w:r>
               <w:rPr>
                 <w:rFonts w:cs="Arial" w:ascii="Arial" w:hAnsi="Arial"/>
-                <w:color w:val="4F81BD" w:themeColor="accent1"/>
+                <w:color w:themeColor="accent1" w:val="4F81BD"/>
                 <w:sz w:val="18"/>
                 <w:szCs w:val="18"/>
                 <w:lang w:val="fr-CH"/>
@@ -2034,7 +2039,7 @@
             <w:r>
               <w:rPr>
                 <w:rFonts w:cs="Arial" w:ascii="Arial" w:hAnsi="Arial"/>
-                <w:color w:val="4F81BD" w:themeColor="accent1"/>
+                <w:color w:themeColor="accent1" w:val="4F81BD"/>
                 <w:sz w:val="18"/>
                 <w:szCs w:val="18"/>
                 <w:lang w:val="fr-CH"/>
@@ -2048,7 +2053,7 @@
                 <w:i w:val="false"/>
                 <w:caps w:val="false"/>
                 <w:smallCaps w:val="false"/>
-                <w:color w:val="4F81BD" w:themeColor="accent1"/>
+                <w:color w:themeColor="accent1" w:val="4F81BD"/>
                 <w:spacing w:val="0"/>
                 <w:sz w:val="18"/>
                 <w:szCs w:val="18"/>
@@ -2059,7 +2064,7 @@
             <w:r>
               <w:rPr>
                 <w:rFonts w:cs="Arial" w:ascii="Arial" w:hAnsi="Arial"/>
-                <w:color w:val="4F81BD" w:themeColor="accent1"/>
+                <w:color w:themeColor="accent1" w:val="4F81BD"/>
                 <w:sz w:val="18"/>
                 <w:szCs w:val="18"/>
                 <w:lang w:val="fr-CH"/>
@@ -2073,7 +2078,7 @@
                 <w:i w:val="false"/>
                 <w:caps w:val="false"/>
                 <w:smallCaps w:val="false"/>
-                <w:color w:val="4F81BD" w:themeColor="accent1"/>
+                <w:color w:themeColor="accent1" w:val="4F81BD"/>
                 <w:spacing w:val="0"/>
                 <w:sz w:val="18"/>
                 <w:szCs w:val="18"/>
@@ -2084,7 +2089,7 @@
             <w:r>
               <w:rPr>
                 <w:rFonts w:cs="Arial" w:ascii="Arial" w:hAnsi="Arial"/>
-                <w:color w:val="4F81BD" w:themeColor="accent1"/>
+                <w:color w:themeColor="accent1" w:val="4F81BD"/>
                 <w:sz w:val="18"/>
                 <w:szCs w:val="18"/>
                 <w:lang w:val="fr-CH"/>
@@ -2098,7 +2103,7 @@
                 <w:i w:val="false"/>
                 <w:caps w:val="false"/>
                 <w:smallCaps w:val="false"/>
-                <w:color w:val="4F81BD" w:themeColor="accent1"/>
+                <w:color w:themeColor="accent1" w:val="4F81BD"/>
                 <w:spacing w:val="0"/>
                 <w:sz w:val="18"/>
                 <w:szCs w:val="18"/>
@@ -2109,7 +2114,7 @@
             <w:r>
               <w:rPr>
                 <w:rFonts w:cs="Arial" w:ascii="Arial" w:hAnsi="Arial"/>
-                <w:color w:val="4F81BD" w:themeColor="accent1"/>
+                <w:color w:themeColor="accent1" w:val="4F81BD"/>
                 <w:sz w:val="18"/>
                 <w:szCs w:val="18"/>
                 <w:lang w:val="fr-CH"/>
@@ -2146,7 +2151,7 @@
               </w:numPr>
               <w:suppressAutoHyphens w:val="true"/>
               <w:spacing w:before="0" w:after="0"/>
-              <w:ind w:right="176" w:hanging="0"/>
+              <w:ind w:hanging="0" w:right="176"/>
               <w:rPr>
                 <w:rFonts w:ascii="Arial" w:hAnsi="Arial"/>
               </w:rPr>
@@ -2411,7 +2416,7 @@
               <w:pStyle w:val="Normal"/>
               <w:widowControl w:val="false"/>
               <w:suppressAutoHyphens w:val="true"/>
-              <w:ind w:left="459" w:hanging="459"/>
+              <w:ind w:hanging="459" w:left="459"/>
               <w:jc w:val="left"/>
               <w:rPr>
                 <w:rFonts w:ascii="Arial" w:hAnsi="Arial"/>
@@ -2462,6 +2467,7 @@
                           <a:prstGeom prst="rect">
                             <a:avLst/>
                           </a:prstGeom>
+                          <a:noFill/>
                         </pic:spPr>
                       </pic:pic>
                     </a:graphicData>
@@ -2514,6 +2520,7 @@
                           <a:prstGeom prst="rect">
                             <a:avLst/>
                           </a:prstGeom>
+                          <a:noFill/>
                         </pic:spPr>
                       </pic:pic>
                     </a:graphicData>
@@ -2602,7 +2609,7 @@
               <w:pStyle w:val="Normal"/>
               <w:widowControl w:val="false"/>
               <w:suppressAutoHyphens w:val="true"/>
-              <w:ind w:left="459" w:hanging="459"/>
+              <w:ind w:hanging="459" w:left="459"/>
               <w:jc w:val="left"/>
               <w:rPr>
                 <w:rFonts w:ascii="Arial" w:hAnsi="Arial"/>
@@ -2653,6 +2660,7 @@
                           <a:prstGeom prst="rect">
                             <a:avLst/>
                           </a:prstGeom>
+                          <a:noFill/>
                         </pic:spPr>
                       </pic:pic>
                     </a:graphicData>
@@ -2705,6 +2713,7 @@
                           <a:prstGeom prst="rect">
                             <a:avLst/>
                           </a:prstGeom>
+                          <a:noFill/>
                         </pic:spPr>
                       </pic:pic>
                     </a:graphicData>
@@ -3300,7 +3309,7 @@
             <w:r>
               <w:rPr>
                 <w:rFonts w:cs="Arial" w:ascii="Arial" w:hAnsi="Arial"/>
-                <w:color w:val="4F81BD" w:themeColor="accent1"/>
+                <w:color w:themeColor="accent1" w:val="4F81BD"/>
                 <w:sz w:val="18"/>
                 <w:szCs w:val="18"/>
                 <w:lang w:val="fr-CH"/>
@@ -3323,7 +3332,7 @@
       <w:r>
         <w:rPr>
           <w:rFonts w:cs="Arial" w:ascii="Arial" w:hAnsi="Arial"/>
-          <w:color w:val="4F81BD" w:themeColor="accent1"/>
+          <w:color w:themeColor="accent1" w:val="4F81BD"/>
           <w:sz w:val="18"/>
           <w:szCs w:val="18"/>
           <w:lang w:val="fr-CH"/>
@@ -3395,7 +3404,7 @@
             <w:r>
               <w:rPr>
                 <w:rFonts w:cs="Arial" w:ascii="Arial" w:hAnsi="Arial"/>
-                <w:color w:val="C0504D" w:themeColor="accent2"/>
+                <w:color w:themeColor="accent2" w:val="C0504D"/>
                 <w:sz w:val="18"/>
                 <w:szCs w:val="18"/>
                 <w:lang w:val="fr-CH"/>
@@ -3432,7 +3441,7 @@
             <w:r>
               <w:rPr>
                 <w:rFonts w:cs="Arial" w:ascii="Arial" w:hAnsi="Arial"/>
-                <w:color w:val="4F81BD" w:themeColor="accent1"/>
+                <w:color w:themeColor="accent1" w:val="4F81BD"/>
                 <w:sz w:val="18"/>
                 <w:szCs w:val="18"/>
                 <w:lang w:val="fr-CH"/>
@@ -3465,7 +3474,6 @@
               <w:rPr>
                 <w:rFonts w:ascii="Arial" w:hAnsi="Arial" w:eastAsia="Noto Sans CJK SC Regular" w:cs="Arial"/>
                 <w:b/>
-                <w:b/>
                 <w:bCs/>
                 <w:color w:val="auto"/>
                 <w:kern w:val="2"/>
@@ -3519,7 +3527,6 @@
               <w:jc w:val="center"/>
               <w:rPr>
                 <w:rFonts w:ascii="Arial" w:hAnsi="Arial" w:eastAsia="Noto Sans CJK SC Regular" w:cs="Arial"/>
-                <w:b/>
                 <w:b/>
                 <w:bCs/>
                 <w:color w:val="auto"/>
@@ -3571,7 +3578,7 @@
             <w:r>
               <w:rPr>
                 <w:rFonts w:eastAsia="Noto Sans CJK SC Regular" w:cs="Arial" w:ascii="Arial" w:hAnsi="Arial"/>
-                <w:color w:val="4F81BD" w:themeColor="accent1"/>
+                <w:color w:themeColor="accent1" w:val="4F81BD"/>
                 <w:kern w:val="2"/>
                 <w:sz w:val="18"/>
                 <w:szCs w:val="18"/>
@@ -3611,7 +3618,7 @@
             <w:r>
               <w:rPr>
                 <w:rFonts w:eastAsia="Noto Sans CJK SC Regular" w:cs="Arial" w:ascii="Arial" w:hAnsi="Arial"/>
-                <w:color w:val="4F81BD" w:themeColor="accent1"/>
+                <w:color w:themeColor="accent1" w:val="4F81BD"/>
                 <w:kern w:val="2"/>
                 <w:sz w:val="18"/>
                 <w:szCs w:val="18"/>
@@ -3649,7 +3656,7 @@
               </w:numPr>
               <w:suppressAutoHyphens w:val="true"/>
               <w:spacing w:before="0" w:after="0"/>
-              <w:ind w:right="176" w:hanging="0"/>
+              <w:ind w:hanging="0" w:right="176"/>
               <w:rPr>
                 <w:rFonts w:ascii="Arial" w:hAnsi="Arial"/>
               </w:rPr>
@@ -3885,7 +3892,7 @@
               <w:pStyle w:val="Normal"/>
               <w:widowControl w:val="false"/>
               <w:suppressAutoHyphens w:val="true"/>
-              <w:ind w:left="459" w:hanging="459"/>
+              <w:ind w:hanging="459" w:left="459"/>
               <w:jc w:val="left"/>
               <w:rPr>
                 <w:rFonts w:ascii="Arial" w:hAnsi="Arial"/>
@@ -3935,6 +3942,7 @@
                           <a:prstGeom prst="rect">
                             <a:avLst/>
                           </a:prstGeom>
+                          <a:noFill/>
                         </pic:spPr>
                       </pic:pic>
                     </a:graphicData>
@@ -3986,6 +3994,7 @@
                           <a:prstGeom prst="rect">
                             <a:avLst/>
                           </a:prstGeom>
+                          <a:noFill/>
                         </pic:spPr>
                       </pic:pic>
                     </a:graphicData>
@@ -4070,7 +4079,7 @@
               <w:pStyle w:val="Normal"/>
               <w:widowControl w:val="false"/>
               <w:suppressAutoHyphens w:val="true"/>
-              <w:ind w:left="459" w:hanging="459"/>
+              <w:ind w:hanging="459" w:left="459"/>
               <w:jc w:val="left"/>
               <w:rPr>
                 <w:rFonts w:ascii="Arial" w:hAnsi="Arial"/>
@@ -4120,6 +4129,7 @@
                           <a:prstGeom prst="rect">
                             <a:avLst/>
                           </a:prstGeom>
+                          <a:noFill/>
                         </pic:spPr>
                       </pic:pic>
                     </a:graphicData>
@@ -4171,6 +4181,7 @@
                           <a:prstGeom prst="rect">
                             <a:avLst/>
                           </a:prstGeom>
+                          <a:noFill/>
                         </pic:spPr>
                       </pic:pic>
                     </a:graphicData>
@@ -4757,7 +4768,7 @@
             <w:r>
               <w:rPr>
                 <w:rFonts w:cs="Arial" w:ascii="Arial" w:hAnsi="Arial"/>
-                <w:color w:val="4F81BD" w:themeColor="accent1"/>
+                <w:color w:themeColor="accent1" w:val="4F81BD"/>
                 <w:sz w:val="18"/>
                 <w:szCs w:val="18"/>
                 <w:lang w:val="fr-CH"/>
@@ -4789,7 +4800,7 @@
             <w:r>
               <w:rPr>
                 <w:rFonts w:cs="Arial" w:ascii="Arial" w:hAnsi="Arial"/>
-                <w:color w:val="C0504D" w:themeColor="accent2"/>
+                <w:color w:themeColor="accent2" w:val="C0504D"/>
                 <w:sz w:val="18"/>
                 <w:szCs w:val="18"/>
                 <w:lang w:val="fr-CH"/>
@@ -4807,7 +4818,7 @@
         <w:suppressAutoHyphens w:val="true"/>
         <w:rPr>
           <w:rFonts w:ascii="Arial" w:hAnsi="Arial" w:cs="Arial"/>
-          <w:color w:val="C0504D" w:themeColor="accent2"/>
+          <w:color w:themeColor="accent2" w:val="C0504D"/>
           <w:sz w:val="18"/>
           <w:szCs w:val="18"/>
           <w:lang w:val="fr-CH"/>
@@ -4816,7 +4827,7 @@
       <w:r>
         <w:rPr>
           <w:rFonts w:cs="Arial" w:ascii="Arial" w:hAnsi="Arial"/>
-          <w:color w:val="C0504D" w:themeColor="accent2"/>
+          <w:color w:themeColor="accent2" w:val="C0504D"/>
           <w:sz w:val="18"/>
           <w:szCs w:val="18"/>
           <w:lang w:val="fr-CH"/>
@@ -4835,7 +4846,7 @@
       <w:r>
         <w:rPr>
           <w:rFonts w:cs="Arial" w:ascii="Arial" w:hAnsi="Arial"/>
-          <w:color w:val="4F81BD" w:themeColor="accent1"/>
+          <w:color w:themeColor="accent1" w:val="4F81BD"/>
           <w:sz w:val="18"/>
           <w:szCs w:val="18"/>
           <w:lang w:val="fr-CH"/>
@@ -4855,7 +4866,7 @@
       <w:r>
         <w:rPr>
           <w:rFonts w:cs="Arial" w:ascii="Arial" w:hAnsi="Arial"/>
-          <w:color w:val="4F81BD" w:themeColor="accent1"/>
+          <w:color w:themeColor="accent1" w:val="4F81BD"/>
           <w:sz w:val="18"/>
           <w:szCs w:val="18"/>
           <w:lang w:val="fr-CH"/>
@@ -4865,7 +4876,7 @@
       <w:r>
         <w:rPr>
           <w:rFonts w:eastAsia="Noto Sans CJK SC Regular" w:cs="Arial" w:ascii="Arial" w:hAnsi="Arial"/>
-          <w:color w:val="4F81BD" w:themeColor="accent1"/>
+          <w:color w:themeColor="accent1" w:val="4F81BD"/>
           <w:kern w:val="2"/>
           <w:sz w:val="18"/>
           <w:szCs w:val="18"/>
@@ -4876,7 +4887,7 @@
       <w:r>
         <w:rPr>
           <w:rFonts w:cs="Arial" w:ascii="Arial" w:hAnsi="Arial"/>
-          <w:color w:val="4F81BD" w:themeColor="accent1"/>
+          <w:color w:themeColor="accent1" w:val="4F81BD"/>
           <w:sz w:val="18"/>
           <w:szCs w:val="18"/>
           <w:lang w:val="fr-CH"/>
@@ -4896,7 +4907,7 @@
       <w:r>
         <w:rPr>
           <w:rFonts w:cs="Arial" w:ascii="Arial" w:hAnsi="Arial"/>
-          <w:color w:val="C0504D" w:themeColor="accent2"/>
+          <w:color w:themeColor="accent2" w:val="C0504D"/>
           <w:sz w:val="18"/>
           <w:szCs w:val="18"/>
           <w:lang w:val="fr-CH"/>
@@ -4940,7 +4951,7 @@
               <w:pStyle w:val="Normal"/>
               <w:widowControl w:val="false"/>
               <w:suppressAutoHyphens w:val="true"/>
-              <w:ind w:left="567" w:hanging="567"/>
+              <w:ind w:hanging="567" w:left="567"/>
               <w:jc w:val="left"/>
               <w:rPr>
                 <w:rFonts w:ascii="Arial" w:hAnsi="Arial"/>
@@ -4990,6 +5001,7 @@
                           <a:prstGeom prst="rect">
                             <a:avLst/>
                           </a:prstGeom>
+                          <a:noFill/>
                         </pic:spPr>
                       </pic:pic>
                     </a:graphicData>
@@ -5041,6 +5053,7 @@
                           <a:prstGeom prst="rect">
                             <a:avLst/>
                           </a:prstGeom>
+                          <a:noFill/>
                         </pic:spPr>
                       </pic:pic>
                     </a:graphicData>
@@ -5075,7 +5088,7 @@
       <w:r>
         <w:rPr>
           <w:rFonts w:cs="Arial" w:ascii="Arial" w:hAnsi="Arial"/>
-          <w:color w:val="C0504D" w:themeColor="accent2"/>
+          <w:color w:themeColor="accent2" w:val="C0504D"/>
           <w:sz w:val="18"/>
           <w:szCs w:val="18"/>
           <w:lang w:val="fr-CH"/>
@@ -5095,7 +5108,7 @@
       <w:r>
         <w:rPr>
           <w:rFonts w:cs="Arial" w:ascii="Arial" w:hAnsi="Arial"/>
-          <w:color w:val="4F81BD" w:themeColor="accent1"/>
+          <w:color w:themeColor="accent1" w:val="4F81BD"/>
           <w:sz w:val="18"/>
           <w:szCs w:val="18"/>
           <w:lang w:val="fr-CH"/>
@@ -5115,7 +5128,7 @@
       <w:r>
         <w:rPr>
           <w:rFonts w:cs="Arial" w:ascii="Arial" w:hAnsi="Arial"/>
-          <w:color w:val="4F81BD" w:themeColor="accent1"/>
+          <w:color w:themeColor="accent1" w:val="4F81BD"/>
           <w:sz w:val="18"/>
           <w:szCs w:val="18"/>
           <w:lang w:val="fr-CH"/>
@@ -5135,7 +5148,7 @@
       <w:r>
         <w:rPr>
           <w:rFonts w:cs="Arial" w:ascii="Arial" w:hAnsi="Arial"/>
-          <w:color w:val="C0504D" w:themeColor="accent2"/>
+          <w:color w:themeColor="accent2" w:val="C0504D"/>
           <w:sz w:val="18"/>
           <w:szCs w:val="18"/>
           <w:lang w:val="fr-CH"/>
@@ -5155,7 +5168,7 @@
       <w:r>
         <w:rPr>
           <w:rFonts w:cs="Arial" w:ascii="Arial" w:hAnsi="Arial"/>
-          <w:color w:val="4F81BD" w:themeColor="accent1"/>
+          <w:color w:themeColor="accent1" w:val="4F81BD"/>
           <w:sz w:val="18"/>
           <w:szCs w:val="18"/>
           <w:lang w:val="fr-CH"/>
@@ -5175,7 +5188,7 @@
       <w:r>
         <w:rPr>
           <w:rFonts w:cs="Arial" w:ascii="Arial" w:hAnsi="Arial"/>
-          <w:color w:val="C0504D" w:themeColor="accent2"/>
+          <w:color w:themeColor="accent2" w:val="C0504D"/>
           <w:sz w:val="18"/>
           <w:szCs w:val="18"/>
           <w:lang w:val="fr-CH"/>
@@ -5184,8 +5197,12 @@
       </w:r>
     </w:p>
     <w:sectPr>
-      <w:headerReference w:type="default" r:id="rId12"/>
-      <w:footerReference w:type="default" r:id="rId13"/>
+      <w:headerReference w:type="even" r:id="rId12"/>
+      <w:headerReference w:type="default" r:id="rId13"/>
+      <w:headerReference w:type="first" r:id="rId14"/>
+      <w:footerReference w:type="even" r:id="rId15"/>
+      <w:footerReference w:type="default" r:id="rId16"/>
+      <w:footerReference w:type="first" r:id="rId17"/>
       <w:type w:val="nextPage"/>
       <w:pgSz w:w="11906" w:h="16838"/>
       <w:pgMar w:left="1843" w:right="1134" w:gutter="0" w:header="0" w:top="1134" w:footer="318" w:bottom="1134"/>
@@ -5199,6 +5216,135 @@
 </file>
 
 <file path=word/footer1.xml><?xml version="1.0" encoding="utf-8"?>
+<w:ftr xmlns:o="urn:schemas-microsoft-com:office:office" xmlns:r="http://schemas.openxmlformats.org/officeDocument/2006/relationships" xmlns:v="urn:schemas-microsoft-com:vml" xmlns:w="http://schemas.openxmlformats.org/wordprocessingml/2006/main" xmlns:w10="urn:schemas-microsoft-com:office:word" xmlns:wp="http://schemas.openxmlformats.org/drawingml/2006/wordprocessingDrawing" xmlns:wps="http://schemas.microsoft.com/office/word/2010/wordprocessingShape" xmlns:wpg="http://schemas.microsoft.com/office/word/2010/wordprocessingGroup" xmlns:mc="http://schemas.openxmlformats.org/markup-compatibility/2006" xmlns:wp14="http://schemas.microsoft.com/office/word/2010/wordprocessingDrawing" xmlns:w14="http://schemas.microsoft.com/office/word/2010/wordml" xmlns:w15="http://schemas.microsoft.com/office/word/2012/wordml" mc:Ignorable="w14 wp14 w15">
+  <w:p>
+    <w:pPr>
+      <w:pStyle w:val="Footer"/>
+      <w:rPr/>
+    </w:pPr>
+    <w:r>
+      <w:rPr/>
+    </w:r>
+  </w:p>
+</w:ftr>
+</file>
+
+<file path=word/footer2.xml><?xml version="1.0" encoding="utf-8"?>
+<w:ftr xmlns:o="urn:schemas-microsoft-com:office:office" xmlns:r="http://schemas.openxmlformats.org/officeDocument/2006/relationships" xmlns:v="urn:schemas-microsoft-com:vml" xmlns:w="http://schemas.openxmlformats.org/wordprocessingml/2006/main" xmlns:w10="urn:schemas-microsoft-com:office:word" xmlns:wp="http://schemas.openxmlformats.org/drawingml/2006/wordprocessingDrawing" xmlns:wps="http://schemas.microsoft.com/office/word/2010/wordprocessingShape" xmlns:wpg="http://schemas.microsoft.com/office/word/2010/wordprocessingGroup" xmlns:mc="http://schemas.openxmlformats.org/markup-compatibility/2006" xmlns:wp14="http://schemas.microsoft.com/office/word/2010/wordprocessingDrawing" xmlns:w14="http://schemas.microsoft.com/office/word/2010/wordml" xmlns:w15="http://schemas.microsoft.com/office/word/2012/wordml" mc:Ignorable="w14 wp14 w15">
+  <w:p>
+    <w:pPr>
+      <w:pStyle w:val="Footer"/>
+      <w:tabs>
+        <w:tab w:val="center" w:pos="4536" w:leader="none"/>
+        <w:tab w:val="right" w:pos="8931" w:leader="none"/>
+        <w:tab w:val="right" w:pos="9072" w:leader="none"/>
+      </w:tabs>
+      <w:rPr>
+        <w:rFonts w:ascii="Arial" w:hAnsi="Arial"/>
+      </w:rPr>
+    </w:pPr>
+    <w:r>
+      <w:rPr>
+        <w:rFonts w:ascii="Arial" w:hAnsi="Arial"/>
+        <w:sz w:val="18"/>
+        <w:szCs w:val="18"/>
+      </w:rPr>
+      <w:fldChar w:fldCharType="begin"/>
+    </w:r>
+    <w:r>
+      <w:rPr>
+        <w:sz w:val="18"/>
+        <w:szCs w:val="18"/>
+        <w:rFonts w:ascii="Arial" w:hAnsi="Arial"/>
+      </w:rPr>
+      <w:instrText xml:space="preserve"> PAGE </w:instrText>
+    </w:r>
+    <w:r>
+      <w:rPr>
+        <w:sz w:val="18"/>
+        <w:szCs w:val="18"/>
+        <w:rFonts w:ascii="Arial" w:hAnsi="Arial"/>
+      </w:rPr>
+      <w:fldChar w:fldCharType="separate"/>
+    </w:r>
+    <w:r>
+      <w:rPr>
+        <w:sz w:val="18"/>
+        <w:szCs w:val="18"/>
+        <w:rFonts w:ascii="Arial" w:hAnsi="Arial"/>
+      </w:rPr>
+      <w:t>3</w:t>
+    </w:r>
+    <w:r>
+      <w:rPr>
+        <w:sz w:val="18"/>
+        <w:szCs w:val="18"/>
+        <w:rFonts w:ascii="Arial" w:hAnsi="Arial"/>
+      </w:rPr>
+      <w:fldChar w:fldCharType="end"/>
+    </w:r>
+    <w:r>
+      <w:rPr>
+        <w:rFonts w:ascii="Arial" w:hAnsi="Arial"/>
+        <w:sz w:val="18"/>
+        <w:szCs w:val="18"/>
+      </w:rPr>
+      <w:t>/</w:t>
+    </w:r>
+    <w:r>
+      <w:rPr>
+        <w:rFonts w:ascii="Arial" w:hAnsi="Arial"/>
+        <w:sz w:val="18"/>
+        <w:szCs w:val="18"/>
+      </w:rPr>
+      <w:fldChar w:fldCharType="begin"/>
+    </w:r>
+    <w:r>
+      <w:rPr>
+        <w:sz w:val="18"/>
+        <w:szCs w:val="18"/>
+        <w:rFonts w:ascii="Arial" w:hAnsi="Arial"/>
+      </w:rPr>
+      <w:instrText xml:space="preserve"> NUMPAGES </w:instrText>
+    </w:r>
+    <w:r>
+      <w:rPr>
+        <w:sz w:val="18"/>
+        <w:szCs w:val="18"/>
+        <w:rFonts w:ascii="Arial" w:hAnsi="Arial"/>
+      </w:rPr>
+      <w:fldChar w:fldCharType="separate"/>
+    </w:r>
+    <w:r>
+      <w:rPr>
+        <w:sz w:val="18"/>
+        <w:szCs w:val="18"/>
+        <w:rFonts w:ascii="Arial" w:hAnsi="Arial"/>
+      </w:rPr>
+      <w:t>3</w:t>
+    </w:r>
+    <w:r>
+      <w:rPr>
+        <w:sz w:val="18"/>
+        <w:szCs w:val="18"/>
+        <w:rFonts w:ascii="Arial" w:hAnsi="Arial"/>
+      </w:rPr>
+      <w:fldChar w:fldCharType="end"/>
+    </w:r>
+    <w:r>
+      <w:rPr>
+        <w:rFonts w:ascii="Arial" w:hAnsi="Arial"/>
+        <w:sz w:val="18"/>
+        <w:szCs w:val="18"/>
+      </w:rPr>
+      <w:tab/>
+      <w:t>{{ caseType }} – {{ dossierNr }}</w:t>
+    </w:r>
+  </w:p>
+</w:ftr>
+</file>
+
+<file path=word/footer3.xml><?xml version="1.0" encoding="utf-8"?>
 <w:ftr xmlns:o="urn:schemas-microsoft-com:office:office" xmlns:r="http://schemas.openxmlformats.org/officeDocument/2006/relationships" xmlns:v="urn:schemas-microsoft-com:vml" xmlns:w="http://schemas.openxmlformats.org/wordprocessingml/2006/main" xmlns:w10="urn:schemas-microsoft-com:office:word" xmlns:wp="http://schemas.openxmlformats.org/drawingml/2006/wordprocessingDrawing" xmlns:wps="http://schemas.microsoft.com/office/word/2010/wordprocessingShape" xmlns:wpg="http://schemas.microsoft.com/office/word/2010/wordprocessingGroup" xmlns:mc="http://schemas.openxmlformats.org/markup-compatibility/2006" xmlns:wp14="http://schemas.microsoft.com/office/word/2010/wordprocessingDrawing" xmlns:w14="http://schemas.microsoft.com/office/word/2010/wordml" xmlns:w15="http://schemas.microsoft.com/office/word/2012/wordml" mc:Ignorable="w14 wp14 w15">
   <w:p>
     <w:pPr>
@@ -5314,6 +5460,34 @@
 </file>
 
 <file path=word/header1.xml><?xml version="1.0" encoding="utf-8"?>
+<w:hdr xmlns:o="urn:schemas-microsoft-com:office:office" xmlns:r="http://schemas.openxmlformats.org/officeDocument/2006/relationships" xmlns:v="urn:schemas-microsoft-com:vml" xmlns:w="http://schemas.openxmlformats.org/wordprocessingml/2006/main" xmlns:w10="urn:schemas-microsoft-com:office:word" xmlns:wp="http://schemas.openxmlformats.org/drawingml/2006/wordprocessingDrawing" xmlns:wps="http://schemas.microsoft.com/office/word/2010/wordprocessingShape" xmlns:wpg="http://schemas.microsoft.com/office/word/2010/wordprocessingGroup" xmlns:mc="http://schemas.openxmlformats.org/markup-compatibility/2006" xmlns:wp14="http://schemas.microsoft.com/office/word/2010/wordprocessingDrawing" xmlns:w14="http://schemas.microsoft.com/office/word/2010/wordml" xmlns:w15="http://schemas.microsoft.com/office/word/2012/wordml" mc:Ignorable="w14 wp14 w15">
+  <w:p>
+    <w:pPr>
+      <w:pStyle w:val="Header"/>
+      <w:rPr/>
+    </w:pPr>
+    <w:r>
+      <w:rPr/>
+    </w:r>
+  </w:p>
+</w:hdr>
+</file>
+
+<file path=word/header2.xml><?xml version="1.0" encoding="utf-8"?>
+<w:hdr xmlns:o="urn:schemas-microsoft-com:office:office" xmlns:r="http://schemas.openxmlformats.org/officeDocument/2006/relationships" xmlns:v="urn:schemas-microsoft-com:vml" xmlns:w="http://schemas.openxmlformats.org/wordprocessingml/2006/main" xmlns:w10="urn:schemas-microsoft-com:office:word" xmlns:wp="http://schemas.openxmlformats.org/drawingml/2006/wordprocessingDrawing" xmlns:wps="http://schemas.microsoft.com/office/word/2010/wordprocessingShape" xmlns:wpg="http://schemas.microsoft.com/office/word/2010/wordprocessingGroup" xmlns:mc="http://schemas.openxmlformats.org/markup-compatibility/2006" xmlns:wp14="http://schemas.microsoft.com/office/word/2010/wordprocessingDrawing" xmlns:w14="http://schemas.microsoft.com/office/word/2010/wordml" xmlns:w15="http://schemas.microsoft.com/office/word/2012/wordml" mc:Ignorable="w14 wp14 w15">
+  <w:p>
+    <w:pPr>
+      <w:pStyle w:val="Header"/>
+      <w:rPr/>
+    </w:pPr>
+    <w:r>
+      <w:rPr/>
+    </w:r>
+  </w:p>
+</w:hdr>
+</file>
+
+<file path=word/header3.xml><?xml version="1.0" encoding="utf-8"?>
 <w:hdr xmlns:o="urn:schemas-microsoft-com:office:office" xmlns:r="http://schemas.openxmlformats.org/officeDocument/2006/relationships" xmlns:v="urn:schemas-microsoft-com:vml" xmlns:w="http://schemas.openxmlformats.org/wordprocessingml/2006/main" xmlns:w10="urn:schemas-microsoft-com:office:word" xmlns:wp="http://schemas.openxmlformats.org/drawingml/2006/wordprocessingDrawing" xmlns:wps="http://schemas.microsoft.com/office/word/2010/wordprocessingShape" xmlns:wpg="http://schemas.microsoft.com/office/word/2010/wordprocessingGroup" xmlns:mc="http://schemas.openxmlformats.org/markup-compatibility/2006" xmlns:wp14="http://schemas.microsoft.com/office/word/2010/wordprocessingDrawing" xmlns:w14="http://schemas.microsoft.com/office/word/2010/wordml" xmlns:w15="http://schemas.microsoft.com/office/word/2012/wordml" mc:Ignorable="w14 wp14 w15">
   <w:p>
     <w:pPr>
@@ -6023,7 +6197,7 @@
     </w:rPr>
   </w:style>
   <w:style w:type="paragraph" w:styleId="Heading1">
-    <w:name w:val="Heading 1"/>
+    <w:name w:val="heading 1"/>
     <w:basedOn w:val="Normal"/>
     <w:qFormat/>
     <w:pPr>
@@ -6045,7 +6219,7 @@
     </w:rPr>
   </w:style>
   <w:style w:type="paragraph" w:styleId="Heading2">
-    <w:name w:val="Heading 2"/>
+    <w:name w:val="heading 2"/>
     <w:basedOn w:val="Normal"/>
     <w:qFormat/>
     <w:pPr>
@@ -6067,7 +6241,7 @@
     </w:rPr>
   </w:style>
   <w:style w:type="paragraph" w:styleId="Heading3">
-    <w:name w:val="Heading 3"/>
+    <w:name w:val="heading 3"/>
     <w:basedOn w:val="Normal"/>
     <w:qFormat/>
     <w:pPr>
@@ -6129,10 +6303,15 @@
       <w:szCs w:val="21"/>
     </w:rPr>
   </w:style>
+  <w:style w:type="character" w:styleId="NumberingSymbols">
+    <w:name w:val="Numbering Symbols"/>
+    <w:qFormat/>
+    <w:rPr/>
+  </w:style>
   <w:style w:type="paragraph" w:styleId="Heading" w:customStyle="1">
     <w:name w:val="Heading"/>
     <w:basedOn w:val="Normal"/>
-    <w:next w:val="TextBody"/>
+    <w:next w:val="BodyText"/>
     <w:qFormat/>
     <w:pPr>
       <w:keepNext w:val="true"/>
@@ -6144,7 +6323,7 @@
       <w:szCs w:val="28"/>
     </w:rPr>
   </w:style>
-  <w:style w:type="paragraph" w:styleId="TextBody">
+  <w:style w:type="paragraph" w:styleId="BodyText">
     <w:name w:val="Body Text"/>
     <w:basedOn w:val="Normal"/>
     <w:pPr>
@@ -6154,36 +6333,11 @@
   </w:style>
   <w:style w:type="paragraph" w:styleId="List">
     <w:name w:val="List"/>
-    <w:basedOn w:val="TextBody"/>
+    <w:basedOn w:val="BodyText"/>
     <w:pPr/>
     <w:rPr/>
   </w:style>
   <w:style w:type="paragraph" w:styleId="Caption">
-    <w:name w:val="Caption"/>
-    <w:basedOn w:val="Normal"/>
-    <w:qFormat/>
-    <w:pPr>
-      <w:suppressLineNumbers/>
-      <w:spacing w:before="120" w:after="120"/>
-    </w:pPr>
-    <w:rPr>
-      <w:rFonts w:cs="Lohit Devanagari"/>
-      <w:i/>
-      <w:iCs/>
-      <w:sz w:val="24"/>
-      <w:szCs w:val="24"/>
-    </w:rPr>
-  </w:style>
-  <w:style w:type="paragraph" w:styleId="Index" w:customStyle="1">
-    <w:name w:val="Index"/>
-    <w:basedOn w:val="Normal"/>
-    <w:qFormat/>
-    <w:pPr>
-      <w:suppressLineNumbers/>
-    </w:pPr>
-    <w:rPr/>
-  </w:style>
-  <w:style w:type="paragraph" w:styleId="Caption1">
     <w:name w:val="caption"/>
     <w:basedOn w:val="Normal"/>
     <w:qFormat/>
@@ -6196,7 +6350,16 @@
       <w:iCs/>
     </w:rPr>
   </w:style>
-  <w:style w:type="paragraph" w:styleId="Berschrift" w:customStyle="1">
+  <w:style w:type="paragraph" w:styleId="Index" w:customStyle="1">
+    <w:name w:val="Index"/>
+    <w:basedOn w:val="Normal"/>
+    <w:qFormat/>
+    <w:pPr>
+      <w:suppressLineNumbers/>
+    </w:pPr>
+    <w:rPr/>
+  </w:style>
+  <w:style w:type="paragraph" w:styleId="berschrift" w:customStyle="1">
     <w:name w:val="Überschrift"/>
     <w:basedOn w:val="Normal"/>
     <w:qFormat/>
@@ -6230,7 +6393,7 @@
   </w:style>
   <w:style w:type="paragraph" w:styleId="Title">
     <w:name w:val="Title"/>
-    <w:basedOn w:val="Berschrift"/>
+    <w:basedOn w:val="berschrift"/>
     <w:qFormat/>
     <w:pPr>
       <w:jc w:val="center"/>
@@ -6266,7 +6429,7 @@
     <w:rPr/>
   </w:style>
   <w:style w:type="paragraph" w:styleId="Header">
-    <w:name w:val="Header"/>
+    <w:name w:val="header"/>
     <w:basedOn w:val="Normal"/>
     <w:link w:val="KopfzeileZchn"/>
     <w:uiPriority w:val="99"/>
@@ -6285,7 +6448,7 @@
     </w:rPr>
   </w:style>
   <w:style w:type="paragraph" w:styleId="Footer">
-    <w:name w:val="Footer"/>
+    <w:name w:val="footer"/>
     <w:basedOn w:val="Normal"/>
     <w:link w:val="FuzeileZchn"/>
     <w:uiPriority w:val="99"/>
@@ -6311,7 +6474,7 @@
     <w:rsid w:val="00636a28"/>
     <w:pPr>
       <w:spacing w:before="0" w:after="0"/>
-      <w:ind w:left="720" w:hanging="0"/>
+      <w:ind w:hanging="0" w:left="720"/>
       <w:contextualSpacing/>
     </w:pPr>
     <w:rPr>
@@ -6389,41 +6552,41 @@
 </file>
 
 <file path=word/theme/theme1.xml><?xml version="1.0" encoding="utf-8"?>
-<a:theme xmlns:a="http://schemas.openxmlformats.org/drawingml/2006/main" name="Larissa">
+<a:theme xmlns:a="http://schemas.openxmlformats.org/drawingml/2006/main" xmlns:r="http://schemas.openxmlformats.org/officeDocument/2006/relationships" name="Larissa">
   <a:themeElements>
     <a:clrScheme name="Larissa">
       <a:dk1>
-        <a:sysClr val="windowText" lastClr="000000"/>
+        <a:srgbClr val="000000"/>
       </a:dk1>
       <a:lt1>
-        <a:sysClr val="window" lastClr="FFFFFF"/>
+        <a:srgbClr val="ffffff"/>
       </a:lt1>
       <a:dk2>
-        <a:srgbClr val="1F497D"/>
+        <a:srgbClr val="1f497d"/>
       </a:dk2>
       <a:lt2>
-        <a:srgbClr val="EEECE1"/>
+        <a:srgbClr val="eeece1"/>
       </a:lt2>
       <a:accent1>
-        <a:srgbClr val="4F81BD"/>
+        <a:srgbClr val="4f81bd"/>
       </a:accent1>
       <a:accent2>
-        <a:srgbClr val="C0504D"/>
+        <a:srgbClr val="c0504d"/>
       </a:accent2>
       <a:accent3>
-        <a:srgbClr val="9BBB59"/>
+        <a:srgbClr val="9bbb59"/>
       </a:accent3>
       <a:accent4>
-        <a:srgbClr val="8064A2"/>
+        <a:srgbClr val="8064a2"/>
       </a:accent4>
       <a:accent5>
-        <a:srgbClr val="4BACC6"/>
+        <a:srgbClr val="4bacc6"/>
       </a:accent5>
       <a:accent6>
-        <a:srgbClr val="F79646"/>
+        <a:srgbClr val="f79646"/>
       </a:accent6>
       <a:hlink>
-        <a:srgbClr val="0000FF"/>
+        <a:srgbClr val="0000ff"/>
       </a:hlink>
       <a:folHlink>
         <a:srgbClr val="800080"/>
@@ -6431,245 +6594,135 @@
     </a:clrScheme>
     <a:fontScheme name="Larissa">
       <a:majorFont>
-        <a:latin typeface="Cambria"/>
+        <a:latin typeface="Cambria" pitchFamily="0" charset="1"/>
         <a:ea typeface=""/>
         <a:cs typeface=""/>
-        <a:font script="Jpan" typeface="ＭＳ ゴシック"/>
-        <a:font script="Hang" typeface="맑은 고딕"/>
-        <a:font script="Hans" typeface="宋体"/>
-        <a:font script="Hant" typeface="新細明體"/>
-        <a:font script="Arab" typeface="Times New Roman"/>
-        <a:font script="Hebr" typeface="Times New Roman"/>
-        <a:font script="Thai" typeface="Angsana New"/>
-        <a:font script="Ethi" typeface="Nyala"/>
-        <a:font script="Beng" typeface="Vrinda"/>
-        <a:font script="Gujr" typeface="Shruti"/>
-        <a:font script="Khmr" typeface="MoolBoran"/>
-        <a:font script="Knda" typeface="Tunga"/>
-        <a:font script="Guru" typeface="Raavi"/>
-        <a:font script="Cans" typeface="Euphemia"/>
-        <a:font script="Cher" typeface="Plantagenet Cherokee"/>
-        <a:font script="Yiii" typeface="Microsoft Yi Baiti"/>
-        <a:font script="Tibt" typeface="Microsoft Himalaya"/>
-        <a:font script="Thaa" typeface="MV Boli"/>
-        <a:font script="Deva" typeface="Mangal"/>
-        <a:font script="Telu" typeface="Gautami"/>
-        <a:font script="Taml" typeface="Latha"/>
-        <a:font script="Syrc" typeface="Estrangelo Edessa"/>
-        <a:font script="Orya" typeface="Kalinga"/>
-        <a:font script="Mlym" typeface="Kartika"/>
-        <a:font script="Laoo" typeface="DokChampa"/>
-        <a:font script="Sinh" typeface="Iskoola Pota"/>
-        <a:font script="Mong" typeface="Mongolian Baiti"/>
-        <a:font script="Viet" typeface="Times New Roman"/>
-        <a:font script="Uigh" typeface="Microsoft Uighur"/>
-        <a:font script="Geor" typeface="Sylfaen"/>
       </a:majorFont>
       <a:minorFont>
-        <a:latin typeface="Calibri"/>
+        <a:latin typeface="Calibri" pitchFamily="0" charset="1"/>
         <a:ea typeface=""/>
         <a:cs typeface=""/>
-        <a:font script="Jpan" typeface="ＭＳ 明朝"/>
-        <a:font script="Hang" typeface="맑은 고딕"/>
-        <a:font script="Hans" typeface="宋体"/>
-        <a:font script="Hant" typeface="新細明體"/>
-        <a:font script="Arab" typeface="Arial"/>
-        <a:font script="Hebr" typeface="Arial"/>
-        <a:font script="Thai" typeface="Cordia New"/>
-        <a:font script="Ethi" typeface="Nyala"/>
-        <a:font script="Beng" typeface="Vrinda"/>
-        <a:font script="Gujr" typeface="Shruti"/>
-        <a:font script="Khmr" typeface="DaunPenh"/>
-        <a:font script="Knda" typeface="Tunga"/>
-        <a:font script="Guru" typeface="Raavi"/>
-        <a:font script="Cans" typeface="Euphemia"/>
-        <a:font script="Cher" typeface="Plantagenet Cherokee"/>
-        <a:font script="Yiii" typeface="Microsoft Yi Baiti"/>
-        <a:font script="Tibt" typeface="Microsoft Himalaya"/>
-        <a:font script="Thaa" typeface="MV Boli"/>
-        <a:font script="Deva" typeface="Mangal"/>
-        <a:font script="Telu" typeface="Gautami"/>
-        <a:font script="Taml" typeface="Latha"/>
-        <a:font script="Syrc" typeface="Estrangelo Edessa"/>
-        <a:font script="Orya" typeface="Kalinga"/>
-        <a:font script="Mlym" typeface="Kartika"/>
-        <a:font script="Laoo" typeface="DokChampa"/>
-        <a:font script="Sinh" typeface="Iskoola Pota"/>
-        <a:font script="Mong" typeface="Mongolian Baiti"/>
-        <a:font script="Viet" typeface="Arial"/>
-        <a:font script="Uigh" typeface="Microsoft Uighur"/>
-        <a:font script="Geor" typeface="Sylfaen"/>
       </a:minorFont>
     </a:fontScheme>
-    <a:fmtScheme name="Larissa">
+    <a:fmtScheme>
       <a:fillStyleLst>
         <a:solidFill>
           <a:schemeClr val="phClr"/>
         </a:solidFill>
-        <a:gradFill rotWithShape="1">
+        <a:gradFill>
           <a:gsLst>
             <a:gs pos="0">
               <a:schemeClr val="phClr">
                 <a:tint val="50000"/>
-                <a:satMod val="300000"/>
               </a:schemeClr>
             </a:gs>
             <a:gs pos="35000">
               <a:schemeClr val="phClr">
                 <a:tint val="37000"/>
-                <a:satMod val="300000"/>
               </a:schemeClr>
             </a:gs>
             <a:gs pos="100000">
               <a:schemeClr val="phClr">
                 <a:tint val="15000"/>
-                <a:satMod val="350000"/>
               </a:schemeClr>
             </a:gs>
           </a:gsLst>
           <a:lin ang="16200000" scaled="1"/>
+          <a:tileRect l="0" t="0" r="0" b="0"/>
         </a:gradFill>
-        <a:gradFill rotWithShape="1">
+        <a:gradFill>
           <a:gsLst>
             <a:gs pos="0">
               <a:schemeClr val="phClr">
                 <a:shade val="51000"/>
-                <a:satMod val="130000"/>
               </a:schemeClr>
             </a:gs>
             <a:gs pos="80000">
               <a:schemeClr val="phClr">
                 <a:shade val="93000"/>
-                <a:satMod val="130000"/>
               </a:schemeClr>
             </a:gs>
             <a:gs pos="100000">
               <a:schemeClr val="phClr">
                 <a:shade val="94000"/>
-                <a:satMod val="135000"/>
               </a:schemeClr>
             </a:gs>
           </a:gsLst>
           <a:lin ang="16200000" scaled="0"/>
+          <a:tileRect l="0" t="0" r="0" b="0"/>
         </a:gradFill>
       </a:fillStyleLst>
       <a:lnStyleLst>
         <a:ln w="9525" cap="flat" cmpd="sng" algn="ctr">
-          <a:solidFill>
-            <a:schemeClr val="phClr">
-              <a:shade val="95000"/>
-              <a:satMod val="105000"/>
-            </a:schemeClr>
-          </a:solidFill>
           <a:prstDash val="solid"/>
         </a:ln>
         <a:ln w="25400" cap="flat" cmpd="sng" algn="ctr">
-          <a:solidFill>
-            <a:schemeClr val="phClr"/>
-          </a:solidFill>
           <a:prstDash val="solid"/>
         </a:ln>
         <a:ln w="38100" cap="flat" cmpd="sng" algn="ctr">
-          <a:solidFill>
-            <a:schemeClr val="phClr"/>
-          </a:solidFill>
           <a:prstDash val="solid"/>
         </a:ln>
       </a:lnStyleLst>
       <a:effectStyleLst>
         <a:effectStyle>
-          <a:effectLst>
-            <a:outerShdw blurRad="40000" dist="20000" dir="5400000" rotWithShape="0">
-              <a:srgbClr val="000000">
-                <a:alpha val="38000"/>
-              </a:srgbClr>
-            </a:outerShdw>
-          </a:effectLst>
+          <a:effectLst/>
         </a:effectStyle>
         <a:effectStyle>
-          <a:effectLst>
-            <a:outerShdw blurRad="40000" dist="23000" dir="5400000" rotWithShape="0">
-              <a:srgbClr val="000000">
-                <a:alpha val="35000"/>
-              </a:srgbClr>
-            </a:outerShdw>
-          </a:effectLst>
+          <a:effectLst/>
         </a:effectStyle>
         <a:effectStyle>
-          <a:effectLst>
-            <a:outerShdw blurRad="40000" dist="23000" dir="5400000" rotWithShape="0">
-              <a:srgbClr val="000000">
-                <a:alpha val="35000"/>
-              </a:srgbClr>
-            </a:outerShdw>
-          </a:effectLst>
-          <a:scene3d>
-            <a:camera prst="orthographicFront">
-              <a:rot lat="0" lon="0" rev="0"/>
-            </a:camera>
-            <a:lightRig rig="threePt" dir="t">
-              <a:rot lat="0" lon="0" rev="1200000"/>
-            </a:lightRig>
-          </a:scene3d>
-          <a:sp3d>
-            <a:bevelT w="63500" h="25400"/>
-          </a:sp3d>
+          <a:effectLst/>
         </a:effectStyle>
       </a:effectStyleLst>
       <a:bgFillStyleLst>
         <a:solidFill>
           <a:schemeClr val="phClr"/>
         </a:solidFill>
-        <a:gradFill rotWithShape="1">
+        <a:gradFill>
           <a:gsLst>
             <a:gs pos="0">
               <a:schemeClr val="phClr">
                 <a:tint val="40000"/>
-                <a:satMod val="350000"/>
               </a:schemeClr>
             </a:gs>
             <a:gs pos="40000">
               <a:schemeClr val="phClr">
                 <a:tint val="45000"/>
                 <a:shade val="99000"/>
-                <a:satMod val="350000"/>
               </a:schemeClr>
             </a:gs>
             <a:gs pos="100000">
               <a:schemeClr val="phClr">
                 <a:shade val="20000"/>
-                <a:satMod val="255000"/>
               </a:schemeClr>
             </a:gs>
           </a:gsLst>
           <a:path path="circle">
             <a:fillToRect l="50000" t="-80000" r="50000" b="180000"/>
           </a:path>
+          <a:tileRect l="0" t="0" r="0" b="0"/>
         </a:gradFill>
-        <a:gradFill rotWithShape="1">
+        <a:gradFill>
           <a:gsLst>
             <a:gs pos="0">
               <a:schemeClr val="phClr">
                 <a:tint val="80000"/>
-                <a:satMod val="300000"/>
               </a:schemeClr>
             </a:gs>
             <a:gs pos="100000">
               <a:schemeClr val="phClr">
                 <a:shade val="30000"/>
-                <a:satMod val="200000"/>
               </a:schemeClr>
             </a:gs>
           </a:gsLst>
           <a:path path="circle">
             <a:fillToRect l="50000" t="50000" r="50000" b="50000"/>
           </a:path>
+          <a:tileRect l="0" t="0" r="0" b="0"/>
         </a:gradFill>
       </a:bgFillStyleLst>
     </a:fmtScheme>
   </a:themeElements>
-  <a:objectDefaults/>
-  <a:extraClrSchemeLst/>
 </a:theme>
 </file>
 

</xml_diff>

<commit_message>
fix(gr): coordinates on situationsplan in doc
</commit_message>
<xml_diff>
--- a/document-merge-service/kt_gr/templatefiles/form.docx
+++ b/document-merge-service/kt_gr/templatefiles/form.docx
@@ -1,28 +1,7 @@
 
 <file path=word/document.xml><?xml version="1.0" encoding="utf-8"?>
-<w:document xmlns:o="urn:schemas-microsoft-com:office:office" xmlns:r="http://schemas.openxmlformats.org/officeDocument/2006/relationships" xmlns:v="urn:schemas-microsoft-com:vml" xmlns:w="http://schemas.openxmlformats.org/wordprocessingml/2006/main" xmlns:w10="urn:schemas-microsoft-com:office:word" xmlns:wp="http://schemas.openxmlformats.org/drawingml/2006/wordprocessingDrawing" xmlns:wps="http://schemas.microsoft.com/office/word/2010/wordprocessingShape" xmlns:wpg="http://schemas.microsoft.com/office/word/2010/wordprocessingGroup" xmlns:mc="http://schemas.openxmlformats.org/markup-compatibility/2006" xmlns:wp14="http://schemas.microsoft.com/office/word/2010/wordprocessingDrawing" xmlns:w14="http://schemas.microsoft.com/office/word/2010/wordml" xmlns:w15="http://schemas.microsoft.com/office/word/2012/wordml" mc:Ignorable="w14 wp14 w15">
+<w:document xmlns:o="urn:schemas-microsoft-com:office:office" xmlns:r="http://schemas.openxmlformats.org/officeDocument/2006/relationships" xmlns:v="urn:schemas-microsoft-com:vml" xmlns:w="http://schemas.openxmlformats.org/wordprocessingml/2006/main" xmlns:w10="urn:schemas-microsoft-com:office:word" xmlns:wp="http://schemas.openxmlformats.org/drawingml/2006/wordprocessingDrawing" xmlns:pic="http://schemas.openxmlformats.org/drawingml/2006/picture" xmlns:wps="http://schemas.microsoft.com/office/word/2010/wordprocessingShape" xmlns:wpg="http://schemas.microsoft.com/office/word/2010/wordprocessingGroup" xmlns:mc="http://schemas.openxmlformats.org/markup-compatibility/2006" xmlns:wp14="http://schemas.microsoft.com/office/word/2010/wordprocessingDrawing" xmlns:w14="http://schemas.microsoft.com/office/word/2010/wordml" xmlns:w15="http://schemas.microsoft.com/office/word/2012/wordml" mc:Ignorable="w14 wp14 w15">
   <w:body>
-    <w:p>
-      <w:pPr>
-        <w:pStyle w:val="Title"/>
-        <w:widowControl w:val="false"/>
-        <w:suppressAutoHyphens w:val="true"/>
-        <w:bidi w:val="0"/>
-        <w:spacing w:before="0" w:after="0"/>
-        <w:ind w:hanging="0" w:left="4229" w:right="0"/>
-        <w:jc w:val="left"/>
-        <w:rPr>
-          <w:rFonts w:ascii="Arial" w:hAnsi="Arial" w:cs="Arial"/>
-          <w:lang w:val="fr-CH"/>
-        </w:rPr>
-      </w:pPr>
-      <w:r>
-        <w:rPr>
-          <w:rFonts w:cs="Arial" w:ascii="Arial" w:hAnsi="Arial"/>
-          <w:lang w:val="fr-CH"/>
-        </w:rPr>
-      </w:r>
-    </w:p>
     <w:p>
       <w:pPr>
         <w:pStyle w:val="Title"/>
@@ -85,9 +64,9 @@
     </w:p>
     <w:p>
       <w:pPr>
-        <w:pStyle w:val="FrameContents"/>
+        <w:pStyle w:val="FrameContentsuser"/>
         <w:suppressAutoHyphens w:val="true"/>
-        <w:overflowPunct w:val="true"/>
+        <w:overflowPunct w:val="false"/>
         <w:bidi w:val="0"/>
         <w:spacing w:before="114" w:after="114"/>
         <w:ind w:hanging="0" w:left="4229" w:right="0"/>
@@ -111,10 +90,10 @@
     </w:p>
     <w:p>
       <w:pPr>
-        <w:pStyle w:val="FrameContents"/>
+        <w:pStyle w:val="FrameContentsuser"/>
         <w:widowControl w:val="false"/>
         <w:suppressAutoHyphens w:val="true"/>
-        <w:overflowPunct w:val="true"/>
+        <w:overflowPunct w:val="false"/>
         <w:bidi w:val="0"/>
         <w:spacing w:before="114" w:after="114"/>
         <w:ind w:hanging="0" w:left="4229" w:right="0"/>
@@ -138,10 +117,10 @@
     </w:p>
     <w:p>
       <w:pPr>
-        <w:pStyle w:val="FrameContents"/>
+        <w:pStyle w:val="FrameContentsuser"/>
         <w:widowControl w:val="false"/>
         <w:suppressAutoHyphens w:val="true"/>
-        <w:overflowPunct w:val="true"/>
+        <w:overflowPunct w:val="false"/>
         <w:bidi w:val="0"/>
         <w:spacing w:before="114" w:after="114"/>
         <w:ind w:hanging="0" w:left="4229" w:right="0"/>
@@ -174,11 +153,15 @@
         <w:jc w:val="left"/>
         <w:rPr>
           <w:rFonts w:ascii="Arial" w:hAnsi="Arial"/>
+          <w:sz w:val="12"/>
+          <w:szCs w:val="12"/>
         </w:rPr>
       </w:pPr>
       <w:r>
         <w:rPr>
           <w:rFonts w:ascii="Arial" w:hAnsi="Arial"/>
+          <w:sz w:val="12"/>
+          <w:szCs w:val="12"/>
         </w:rPr>
       </w:r>
     </w:p>
@@ -1283,7 +1266,9 @@
         </w:tc>
       </w:tr>
       <w:tr>
-        <w:trPr/>
+        <w:trPr>
+          <w:trHeight w:val="107" w:hRule="atLeast"/>
+        </w:trPr>
         <w:tc>
           <w:tcPr>
             <w:tcW w:w="3868" w:type="dxa"/>
@@ -1562,43 +1547,105 @@
     <w:p>
       <w:pPr>
         <w:pStyle w:val="Normal"/>
+        <w:jc w:val="left"/>
         <w:rPr>
+          <w:rFonts w:ascii="Arial" w:hAnsi="Arial"/>
+        </w:rPr>
+      </w:pPr>
+      <w:r>
+        <w:rPr>
+          <w:rFonts w:ascii="Arial" w:hAnsi="Arial"/>
+          <w:sz w:val="18"/>
+          <w:szCs w:val="18"/>
+          <w:lang w:val="fr-CH"/>
+        </w:rPr>
+        <w:t>{% if situationsplan %}{{ "situationsplan" | image(1</w:t>
+      </w:r>
+      <w:r>
+        <w:rPr>
+          <w:rFonts w:ascii="Arial" w:hAnsi="Arial"/>
+          <w:sz w:val="18"/>
+          <w:szCs w:val="18"/>
+          <w:lang w:val="fr-CH"/>
+        </w:rPr>
+        <w:t>56</w:t>
+      </w:r>
+      <w:r>
+        <w:rPr>
+          <w:rFonts w:ascii="Arial" w:hAnsi="Arial"/>
+          <w:sz w:val="18"/>
+          <w:szCs w:val="18"/>
+          <w:lang w:val="fr-CH"/>
+        </w:rPr>
+        <w:t xml:space="preserve">, </w:t>
+      </w:r>
+      <w:r>
+        <w:rPr>
+          <w:rFonts w:ascii="Arial" w:hAnsi="Arial"/>
+          <w:sz w:val="18"/>
+          <w:szCs w:val="18"/>
+          <w:lang w:val="fr-CH"/>
+        </w:rPr>
+        <w:t>88</w:t>
+      </w:r>
+      <w:r>
+        <w:rPr>
+          <w:rFonts w:ascii="Arial" w:hAnsi="Arial"/>
+          <w:sz w:val="18"/>
+          <w:szCs w:val="18"/>
+          <w:lang w:val="fr-CH"/>
+        </w:rPr>
+        <w:t xml:space="preserve">, </w:t>
+      </w:r>
+      <w:r>
+        <w:rPr>
+          <w:rFonts w:ascii="Arial" w:hAnsi="Arial"/>
+          <w:sz w:val="18"/>
+          <w:szCs w:val="18"/>
+          <w:lang w:val="fr-CH"/>
+        </w:rPr>
+        <w:t>False</w:t>
+      </w:r>
+      <w:r>
+        <w:rPr>
+          <w:rFonts w:ascii="Arial" w:hAnsi="Arial"/>
+          <w:sz w:val="18"/>
+          <w:szCs w:val="18"/>
+          <w:lang w:val="fr-CH"/>
+        </w:rPr>
+        <w:t>) }}{% endif %}</w:t>
+      </w:r>
+    </w:p>
+    <w:p>
+      <w:pPr>
+        <w:pStyle w:val="Normal"/>
+        <w:jc w:val="right"/>
+        <w:rPr>
+          <w:sz w:val="18"/>
+          <w:szCs w:val="18"/>
           <w:lang w:val="fr-CH"/>
         </w:rPr>
       </w:pPr>
       <w:r>
         <w:rPr>
-          <w:lang w:val="fr-CH"/>
+          <w:rFonts w:ascii="Arial" w:hAnsi="Arial"/>
         </w:rPr>
-        <w:t>{%p if situationsplan %}</w:t>
       </w:r>
     </w:p>
     <w:p>
       <w:pPr>
         <w:pStyle w:val="Normal"/>
-        <w:rPr>
-          <w:lang w:val="fr-CH"/>
-        </w:rPr>
+        <w:jc w:val="right"/>
+        <w:rPr/>
       </w:pPr>
       <w:r>
         <w:rPr>
-          <w:lang w:val="fr-CH"/>
+          <w:rFonts w:ascii="Arial" w:hAnsi="Arial"/>
+          <w:sz w:val="18"/>
+          <w:szCs w:val="18"/>
+          <w:lang w:val="fr-CH" w:eastAsia="zh-CN" w:bidi="hi-IN"/>
         </w:rPr>
-        <w:t>{{ "situationsplan" | image(135, 78, True) }}</w:t>
-      </w:r>
-    </w:p>
-    <w:p>
-      <w:pPr>
-        <w:pStyle w:val="Normal"/>
-        <w:rPr>
-          <w:lang w:val="fr-CH"/>
-        </w:rPr>
-      </w:pPr>
-      <w:r>
-        <w:rPr>
-          <w:lang w:val="fr-CH"/>
-        </w:rPr>
-        <w:t>{%p endif %}</w:t>
+        <w:t>{% if gisCoordinatesCenter %}{{ gisCoordinatesCenter }}    {% endif%}</w:t>
       </w:r>
       <w:r>
         <w:br w:type="page"/>
@@ -1607,12 +1654,8 @@
     <w:p>
       <w:pPr>
         <w:pStyle w:val="Normal"/>
-        <w:widowControl w:val="false"/>
-        <w:suppressAutoHyphens w:val="true"/>
-        <w:spacing w:before="0" w:after="0"/>
-        <w:rPr>
-          <w:rFonts w:ascii="Arial" w:hAnsi="Arial"/>
-        </w:rPr>
+        <w:jc w:val="right"/>
+        <w:rPr/>
       </w:pPr>
       <w:r>
         <w:rPr>
@@ -5216,7 +5259,7 @@
 </file>
 
 <file path=word/footer1.xml><?xml version="1.0" encoding="utf-8"?>
-<w:ftr xmlns:o="urn:schemas-microsoft-com:office:office" xmlns:r="http://schemas.openxmlformats.org/officeDocument/2006/relationships" xmlns:v="urn:schemas-microsoft-com:vml" xmlns:w="http://schemas.openxmlformats.org/wordprocessingml/2006/main" xmlns:w10="urn:schemas-microsoft-com:office:word" xmlns:wp="http://schemas.openxmlformats.org/drawingml/2006/wordprocessingDrawing" xmlns:wps="http://schemas.microsoft.com/office/word/2010/wordprocessingShape" xmlns:wpg="http://schemas.microsoft.com/office/word/2010/wordprocessingGroup" xmlns:mc="http://schemas.openxmlformats.org/markup-compatibility/2006" xmlns:wp14="http://schemas.microsoft.com/office/word/2010/wordprocessingDrawing" xmlns:w14="http://schemas.microsoft.com/office/word/2010/wordml" xmlns:w15="http://schemas.microsoft.com/office/word/2012/wordml" mc:Ignorable="w14 wp14 w15">
+<w:ftr xmlns:o="urn:schemas-microsoft-com:office:office" xmlns:r="http://schemas.openxmlformats.org/officeDocument/2006/relationships" xmlns:v="urn:schemas-microsoft-com:vml" xmlns:w="http://schemas.openxmlformats.org/wordprocessingml/2006/main" xmlns:w10="urn:schemas-microsoft-com:office:word" xmlns:wp="http://schemas.openxmlformats.org/drawingml/2006/wordprocessingDrawing" xmlns:pic="http://schemas.openxmlformats.org/drawingml/2006/picture" xmlns:wps="http://schemas.microsoft.com/office/word/2010/wordprocessingShape" xmlns:wpg="http://schemas.microsoft.com/office/word/2010/wordprocessingGroup" xmlns:mc="http://schemas.openxmlformats.org/markup-compatibility/2006" xmlns:wp14="http://schemas.microsoft.com/office/word/2010/wordprocessingDrawing" xmlns:w14="http://schemas.microsoft.com/office/word/2010/wordml" xmlns:w15="http://schemas.microsoft.com/office/word/2012/wordml" mc:Ignorable="w14 wp14 w15">
   <w:p>
     <w:pPr>
       <w:pStyle w:val="Footer"/>
@@ -5230,7 +5273,7 @@
 </file>
 
 <file path=word/footer2.xml><?xml version="1.0" encoding="utf-8"?>
-<w:ftr xmlns:o="urn:schemas-microsoft-com:office:office" xmlns:r="http://schemas.openxmlformats.org/officeDocument/2006/relationships" xmlns:v="urn:schemas-microsoft-com:vml" xmlns:w="http://schemas.openxmlformats.org/wordprocessingml/2006/main" xmlns:w10="urn:schemas-microsoft-com:office:word" xmlns:wp="http://schemas.openxmlformats.org/drawingml/2006/wordprocessingDrawing" xmlns:wps="http://schemas.microsoft.com/office/word/2010/wordprocessingShape" xmlns:wpg="http://schemas.microsoft.com/office/word/2010/wordprocessingGroup" xmlns:mc="http://schemas.openxmlformats.org/markup-compatibility/2006" xmlns:wp14="http://schemas.microsoft.com/office/word/2010/wordprocessingDrawing" xmlns:w14="http://schemas.microsoft.com/office/word/2010/wordml" xmlns:w15="http://schemas.microsoft.com/office/word/2012/wordml" mc:Ignorable="w14 wp14 w15">
+<w:ftr xmlns:o="urn:schemas-microsoft-com:office:office" xmlns:r="http://schemas.openxmlformats.org/officeDocument/2006/relationships" xmlns:v="urn:schemas-microsoft-com:vml" xmlns:w="http://schemas.openxmlformats.org/wordprocessingml/2006/main" xmlns:w10="urn:schemas-microsoft-com:office:word" xmlns:wp="http://schemas.openxmlformats.org/drawingml/2006/wordprocessingDrawing" xmlns:pic="http://schemas.openxmlformats.org/drawingml/2006/picture" xmlns:wps="http://schemas.microsoft.com/office/word/2010/wordprocessingShape" xmlns:wpg="http://schemas.microsoft.com/office/word/2010/wordprocessingGroup" xmlns:mc="http://schemas.openxmlformats.org/markup-compatibility/2006" xmlns:wp14="http://schemas.microsoft.com/office/word/2010/wordprocessingDrawing" xmlns:w14="http://schemas.microsoft.com/office/word/2010/wordml" xmlns:w15="http://schemas.microsoft.com/office/word/2012/wordml" mc:Ignorable="w14 wp14 w15">
   <w:p>
     <w:pPr>
       <w:pStyle w:val="Footer"/>
@@ -5345,7 +5388,7 @@
 </file>
 
 <file path=word/footer3.xml><?xml version="1.0" encoding="utf-8"?>
-<w:ftr xmlns:o="urn:schemas-microsoft-com:office:office" xmlns:r="http://schemas.openxmlformats.org/officeDocument/2006/relationships" xmlns:v="urn:schemas-microsoft-com:vml" xmlns:w="http://schemas.openxmlformats.org/wordprocessingml/2006/main" xmlns:w10="urn:schemas-microsoft-com:office:word" xmlns:wp="http://schemas.openxmlformats.org/drawingml/2006/wordprocessingDrawing" xmlns:wps="http://schemas.microsoft.com/office/word/2010/wordprocessingShape" xmlns:wpg="http://schemas.microsoft.com/office/word/2010/wordprocessingGroup" xmlns:mc="http://schemas.openxmlformats.org/markup-compatibility/2006" xmlns:wp14="http://schemas.microsoft.com/office/word/2010/wordprocessingDrawing" xmlns:w14="http://schemas.microsoft.com/office/word/2010/wordml" xmlns:w15="http://schemas.microsoft.com/office/word/2012/wordml" mc:Ignorable="w14 wp14 w15">
+<w:ftr xmlns:o="urn:schemas-microsoft-com:office:office" xmlns:r="http://schemas.openxmlformats.org/officeDocument/2006/relationships" xmlns:v="urn:schemas-microsoft-com:vml" xmlns:w="http://schemas.openxmlformats.org/wordprocessingml/2006/main" xmlns:w10="urn:schemas-microsoft-com:office:word" xmlns:wp="http://schemas.openxmlformats.org/drawingml/2006/wordprocessingDrawing" xmlns:pic="http://schemas.openxmlformats.org/drawingml/2006/picture" xmlns:wps="http://schemas.microsoft.com/office/word/2010/wordprocessingShape" xmlns:wpg="http://schemas.microsoft.com/office/word/2010/wordprocessingGroup" xmlns:mc="http://schemas.openxmlformats.org/markup-compatibility/2006" xmlns:wp14="http://schemas.microsoft.com/office/word/2010/wordprocessingDrawing" xmlns:w14="http://schemas.microsoft.com/office/word/2010/wordml" xmlns:w15="http://schemas.microsoft.com/office/word/2012/wordml" mc:Ignorable="w14 wp14 w15">
   <w:p>
     <w:pPr>
       <w:pStyle w:val="Footer"/>
@@ -5460,7 +5503,7 @@
 </file>
 
 <file path=word/header1.xml><?xml version="1.0" encoding="utf-8"?>
-<w:hdr xmlns:o="urn:schemas-microsoft-com:office:office" xmlns:r="http://schemas.openxmlformats.org/officeDocument/2006/relationships" xmlns:v="urn:schemas-microsoft-com:vml" xmlns:w="http://schemas.openxmlformats.org/wordprocessingml/2006/main" xmlns:w10="urn:schemas-microsoft-com:office:word" xmlns:wp="http://schemas.openxmlformats.org/drawingml/2006/wordprocessingDrawing" xmlns:wps="http://schemas.microsoft.com/office/word/2010/wordprocessingShape" xmlns:wpg="http://schemas.microsoft.com/office/word/2010/wordprocessingGroup" xmlns:mc="http://schemas.openxmlformats.org/markup-compatibility/2006" xmlns:wp14="http://schemas.microsoft.com/office/word/2010/wordprocessingDrawing" xmlns:w14="http://schemas.microsoft.com/office/word/2010/wordml" xmlns:w15="http://schemas.microsoft.com/office/word/2012/wordml" mc:Ignorable="w14 wp14 w15">
+<w:hdr xmlns:o="urn:schemas-microsoft-com:office:office" xmlns:r="http://schemas.openxmlformats.org/officeDocument/2006/relationships" xmlns:v="urn:schemas-microsoft-com:vml" xmlns:w="http://schemas.openxmlformats.org/wordprocessingml/2006/main" xmlns:w10="urn:schemas-microsoft-com:office:word" xmlns:wp="http://schemas.openxmlformats.org/drawingml/2006/wordprocessingDrawing" xmlns:pic="http://schemas.openxmlformats.org/drawingml/2006/picture" xmlns:wps="http://schemas.microsoft.com/office/word/2010/wordprocessingShape" xmlns:wpg="http://schemas.microsoft.com/office/word/2010/wordprocessingGroup" xmlns:mc="http://schemas.openxmlformats.org/markup-compatibility/2006" xmlns:wp14="http://schemas.microsoft.com/office/word/2010/wordprocessingDrawing" xmlns:w14="http://schemas.microsoft.com/office/word/2010/wordml" xmlns:w15="http://schemas.microsoft.com/office/word/2012/wordml" mc:Ignorable="w14 wp14 w15">
   <w:p>
     <w:pPr>
       <w:pStyle w:val="Header"/>
@@ -5474,7 +5517,7 @@
 </file>
 
 <file path=word/header2.xml><?xml version="1.0" encoding="utf-8"?>
-<w:hdr xmlns:o="urn:schemas-microsoft-com:office:office" xmlns:r="http://schemas.openxmlformats.org/officeDocument/2006/relationships" xmlns:v="urn:schemas-microsoft-com:vml" xmlns:w="http://schemas.openxmlformats.org/wordprocessingml/2006/main" xmlns:w10="urn:schemas-microsoft-com:office:word" xmlns:wp="http://schemas.openxmlformats.org/drawingml/2006/wordprocessingDrawing" xmlns:wps="http://schemas.microsoft.com/office/word/2010/wordprocessingShape" xmlns:wpg="http://schemas.microsoft.com/office/word/2010/wordprocessingGroup" xmlns:mc="http://schemas.openxmlformats.org/markup-compatibility/2006" xmlns:wp14="http://schemas.microsoft.com/office/word/2010/wordprocessingDrawing" xmlns:w14="http://schemas.microsoft.com/office/word/2010/wordml" xmlns:w15="http://schemas.microsoft.com/office/word/2012/wordml" mc:Ignorable="w14 wp14 w15">
+<w:hdr xmlns:o="urn:schemas-microsoft-com:office:office" xmlns:r="http://schemas.openxmlformats.org/officeDocument/2006/relationships" xmlns:v="urn:schemas-microsoft-com:vml" xmlns:w="http://schemas.openxmlformats.org/wordprocessingml/2006/main" xmlns:w10="urn:schemas-microsoft-com:office:word" xmlns:wp="http://schemas.openxmlformats.org/drawingml/2006/wordprocessingDrawing" xmlns:pic="http://schemas.openxmlformats.org/drawingml/2006/picture" xmlns:wps="http://schemas.microsoft.com/office/word/2010/wordprocessingShape" xmlns:wpg="http://schemas.microsoft.com/office/word/2010/wordprocessingGroup" xmlns:mc="http://schemas.openxmlformats.org/markup-compatibility/2006" xmlns:wp14="http://schemas.microsoft.com/office/word/2010/wordprocessingDrawing" xmlns:w14="http://schemas.microsoft.com/office/word/2010/wordml" xmlns:w15="http://schemas.microsoft.com/office/word/2012/wordml" mc:Ignorable="w14 wp14 w15">
   <w:p>
     <w:pPr>
       <w:pStyle w:val="Header"/>
@@ -5488,7 +5531,7 @@
 </file>
 
 <file path=word/header3.xml><?xml version="1.0" encoding="utf-8"?>
-<w:hdr xmlns:o="urn:schemas-microsoft-com:office:office" xmlns:r="http://schemas.openxmlformats.org/officeDocument/2006/relationships" xmlns:v="urn:schemas-microsoft-com:vml" xmlns:w="http://schemas.openxmlformats.org/wordprocessingml/2006/main" xmlns:w10="urn:schemas-microsoft-com:office:word" xmlns:wp="http://schemas.openxmlformats.org/drawingml/2006/wordprocessingDrawing" xmlns:wps="http://schemas.microsoft.com/office/word/2010/wordprocessingShape" xmlns:wpg="http://schemas.microsoft.com/office/word/2010/wordprocessingGroup" xmlns:mc="http://schemas.openxmlformats.org/markup-compatibility/2006" xmlns:wp14="http://schemas.microsoft.com/office/word/2010/wordprocessingDrawing" xmlns:w14="http://schemas.microsoft.com/office/word/2010/wordml" xmlns:w15="http://schemas.microsoft.com/office/word/2012/wordml" mc:Ignorable="w14 wp14 w15">
+<w:hdr xmlns:o="urn:schemas-microsoft-com:office:office" xmlns:r="http://schemas.openxmlformats.org/officeDocument/2006/relationships" xmlns:v="urn:schemas-microsoft-com:vml" xmlns:w="http://schemas.openxmlformats.org/wordprocessingml/2006/main" xmlns:w10="urn:schemas-microsoft-com:office:word" xmlns:wp="http://schemas.openxmlformats.org/drawingml/2006/wordprocessingDrawing" xmlns:pic="http://schemas.openxmlformats.org/drawingml/2006/picture" xmlns:wps="http://schemas.microsoft.com/office/word/2010/wordprocessingShape" xmlns:wpg="http://schemas.microsoft.com/office/word/2010/wordprocessingGroup" xmlns:mc="http://schemas.openxmlformats.org/markup-compatibility/2006" xmlns:wp14="http://schemas.microsoft.com/office/word/2010/wordprocessingDrawing" xmlns:w14="http://schemas.microsoft.com/office/word/2010/wordml" xmlns:w15="http://schemas.microsoft.com/office/word/2012/wordml" mc:Ignorable="w14 wp14 w15">
   <w:p>
     <w:pPr>
       <w:pStyle w:val="Header"/>
@@ -6504,8 +6547,8 @@
       <w:bCs/>
     </w:rPr>
   </w:style>
-  <w:style w:type="paragraph" w:styleId="FrameContents">
-    <w:name w:val="Frame Contents"/>
+  <w:style w:type="paragraph" w:styleId="FrameContentsuser">
+    <w:name w:val="Frame Contents (user)"/>
     <w:basedOn w:val="Normal"/>
     <w:qFormat/>
     <w:pPr/>

</xml_diff>

<commit_message>
fix(gr): add calculated fields to template
</commit_message>
<xml_diff>
--- a/document-merge-service/kt_gr/templatefiles/form.docx
+++ b/document-merge-service/kt_gr/templatefiles/form.docx
@@ -1,6 +1,6 @@
 
 <file path=word/document.xml><?xml version="1.0" encoding="utf-8"?>
-<w:document xmlns:o="urn:schemas-microsoft-com:office:office" xmlns:r="http://schemas.openxmlformats.org/officeDocument/2006/relationships" xmlns:v="urn:schemas-microsoft-com:vml" xmlns:w="http://schemas.openxmlformats.org/wordprocessingml/2006/main" xmlns:w10="urn:schemas-microsoft-com:office:word" xmlns:wp="http://schemas.openxmlformats.org/drawingml/2006/wordprocessingDrawing" xmlns:pic="http://schemas.openxmlformats.org/drawingml/2006/picture" xmlns:wps="http://schemas.microsoft.com/office/word/2010/wordprocessingShape" xmlns:wpg="http://schemas.microsoft.com/office/word/2010/wordprocessingGroup" xmlns:mc="http://schemas.openxmlformats.org/markup-compatibility/2006" xmlns:wp14="http://schemas.microsoft.com/office/word/2010/wordprocessingDrawing" xmlns:w14="http://schemas.microsoft.com/office/word/2010/wordml" xmlns:w15="http://schemas.microsoft.com/office/word/2012/wordml" mc:Ignorable="w14 wp14 w15">
+<w:document xmlns:o="urn:schemas-microsoft-com:office:office" xmlns:r="http://schemas.openxmlformats.org/officeDocument/2006/relationships" xmlns:v="urn:schemas-microsoft-com:vml" xmlns:w="http://schemas.openxmlformats.org/wordprocessingml/2006/main" xmlns:w10="urn:schemas-microsoft-com:office:word" xmlns:wp="http://schemas.openxmlformats.org/drawingml/2006/wordprocessingDrawing" xmlns:wps="http://schemas.microsoft.com/office/word/2010/wordprocessingShape" xmlns:wpg="http://schemas.microsoft.com/office/word/2010/wordprocessingGroup" xmlns:mc="http://schemas.openxmlformats.org/markup-compatibility/2006" xmlns:wp14="http://schemas.microsoft.com/office/word/2010/wordprocessingDrawing" xmlns:w14="http://schemas.microsoft.com/office/word/2010/wordml" xmlns:w15="http://schemas.microsoft.com/office/word/2012/wordml" mc:Ignorable="w14 wp14 w15">
   <w:body>
     <w:p>
       <w:pPr>
@@ -12,14 +12,21 @@
         <w:ind w:hanging="0" w:left="4229" w:right="0"/>
         <w:jc w:val="left"/>
         <w:rPr>
-          <w:rFonts w:ascii="Arial" w:hAnsi="Arial"/>
+          <w:b/>
+          <w:bCs/>
+          <w:strike/>
+          <w:u w:val="single"/>
         </w:rPr>
       </w:pPr>
       <w:r>
         <w:rPr>
           <w:rFonts w:cs="Arial" w:ascii="Arial" w:hAnsi="Arial"/>
+          <w:b/>
+          <w:bCs/>
+          <w:strike/>
           <w:sz w:val="48"/>
           <w:szCs w:val="44"/>
+          <w:u w:val="single"/>
           <w:lang w:val="fr-CH"/>
         </w:rPr>
         <w:t>{{ caseType }}</w:t>
@@ -31,10 +38,12 @@
           <w:rFonts w:eastAsia="Noto Sans CJK SC Regular" w:cs="Arial" w:ascii="Arial" w:hAnsi="Arial"/>
           <w:b/>
           <w:bCs/>
+          <w:strike/>
           <w:color w:val="auto"/>
           <w:kern w:val="2"/>
           <w:sz w:val="48"/>
           <w:szCs w:val="44"/>
+          <w:u w:val="single"/>
           <w:lang w:val="fr-CH" w:eastAsia="zh-CN" w:bidi="hi-IN"/>
         </w:rPr>
         <w:t>dossierNr</w:t>
@@ -42,8 +51,12 @@
       <w:r>
         <w:rPr>
           <w:rFonts w:cs="Arial" w:ascii="Arial" w:hAnsi="Arial"/>
+          <w:b/>
+          <w:bCs/>
+          <w:strike/>
           <w:sz w:val="48"/>
           <w:szCs w:val="44"/>
+          <w:u w:val="single"/>
           <w:lang w:val="fr-CH"/>
         </w:rPr>
         <w:t xml:space="preserve"> }}</w:t>
@@ -52,9 +65,13 @@
       <w:r>
         <w:rPr>
           <w:rFonts w:cs="Arial" w:ascii="Arial" w:hAnsi="Arial"/>
+          <w:b/>
+          <w:bCs/>
+          <w:strike/>
           <w:color w:val="808080"/>
           <w:sz w:val="32"/>
           <w:szCs w:val="32"/>
+          <w:u w:val="single"/>
           <w:lang w:val="fr-CH"/>
         </w:rPr>
         <w:t>{% if formType %}{{ formType }}</w:t>
@@ -64,7 +81,7 @@
     </w:p>
     <w:p>
       <w:pPr>
-        <w:pStyle w:val="FrameContentsuser"/>
+        <w:pStyle w:val="FrameContents"/>
         <w:suppressAutoHyphens w:val="true"/>
         <w:overflowPunct w:val="false"/>
         <w:bidi w:val="0"/>
@@ -72,17 +89,22 @@
         <w:ind w:hanging="0" w:left="4229" w:right="0"/>
         <w:jc w:val="left"/>
         <w:rPr>
-          <w:rFonts w:ascii="Arial" w:hAnsi="Arial"/>
+          <w:b/>
+          <w:bCs/>
+          <w:strike/>
+          <w:u w:val="single"/>
         </w:rPr>
       </w:pPr>
       <w:r>
         <w:rPr>
           <w:rFonts w:cs="Arial" w:ascii="Arial" w:hAnsi="Arial"/>
-          <w:b w:val="false"/>
-          <w:bCs w:val="false"/>
+          <w:b/>
+          <w:bCs/>
+          <w:strike/>
           <w:color w:val="808080"/>
           <w:sz w:val="18"/>
           <w:szCs w:val="18"/>
+          <w:u w:val="single"/>
           <w:lang w:val="fr-CH"/>
         </w:rPr>
         <w:t>{{ createdAt }}</w:t>
@@ -90,7 +112,7 @@
     </w:p>
     <w:p>
       <w:pPr>
-        <w:pStyle w:val="FrameContentsuser"/>
+        <w:pStyle w:val="FrameContents"/>
         <w:widowControl w:val="false"/>
         <w:suppressAutoHyphens w:val="true"/>
         <w:overflowPunct w:val="false"/>
@@ -99,17 +121,22 @@
         <w:ind w:hanging="0" w:left="4229" w:right="0"/>
         <w:jc w:val="left"/>
         <w:rPr>
-          <w:rFonts w:ascii="Arial" w:hAnsi="Arial"/>
+          <w:b/>
+          <w:bCs/>
+          <w:strike/>
+          <w:u w:val="single"/>
         </w:rPr>
       </w:pPr>
       <w:r>
         <w:rPr>
           <w:rFonts w:cs="Arial" w:ascii="Arial" w:hAnsi="Arial"/>
-          <w:b w:val="false"/>
-          <w:bCs w:val="false"/>
+          <w:b/>
+          <w:bCs/>
+          <w:strike/>
           <w:color w:val="808080"/>
           <w:sz w:val="18"/>
           <w:szCs w:val="18"/>
+          <w:u w:val="single"/>
           <w:lang w:val="fr-CH"/>
         </w:rPr>
         <w:t>{{ modifiedAt }}</w:t>
@@ -117,7 +144,7 @@
     </w:p>
     <w:p>
       <w:pPr>
-        <w:pStyle w:val="FrameContentsuser"/>
+        <w:pStyle w:val="FrameContents"/>
         <w:widowControl w:val="false"/>
         <w:suppressAutoHyphens w:val="true"/>
         <w:overflowPunct w:val="false"/>
@@ -126,17 +153,22 @@
         <w:ind w:hanging="0" w:left="4229" w:right="0"/>
         <w:jc w:val="left"/>
         <w:rPr>
-          <w:rFonts w:ascii="Arial" w:hAnsi="Arial"/>
+          <w:b/>
+          <w:bCs/>
+          <w:strike/>
+          <w:u w:val="single"/>
         </w:rPr>
       </w:pPr>
       <w:r>
         <w:rPr>
           <w:rFonts w:cs="Arial" w:ascii="Arial" w:hAnsi="Arial"/>
-          <w:b w:val="false"/>
-          <w:bCs w:val="false"/>
+          <w:b/>
+          <w:bCs/>
+          <w:strike/>
           <w:color w:val="808080"/>
           <w:sz w:val="18"/>
           <w:szCs w:val="18"/>
+          <w:u w:val="single"/>
           <w:lang w:val="fr-CH"/>
         </w:rPr>
         <w:t>{{ generatedAt }}</w:t>
@@ -201,9 +233,7 @@
               <w:suppressAutoHyphens w:val="true"/>
               <w:spacing w:before="0" w:after="0"/>
               <w:ind w:hanging="0" w:right="176"/>
-              <w:rPr>
-                <w:rFonts w:ascii="Arial" w:hAnsi="Arial"/>
-              </w:rPr>
+              <w:rPr/>
             </w:pPr>
             <w:r>
               <w:rPr>
@@ -259,9 +289,7 @@
               <w:suppressAutoHyphens w:val="true"/>
               <w:spacing w:before="0" w:after="0"/>
               <w:ind w:hanging="0" w:right="176"/>
-              <w:rPr>
-                <w:rFonts w:ascii="Arial" w:hAnsi="Arial"/>
-              </w:rPr>
+              <w:rPr/>
             </w:pPr>
             <w:r>
               <w:rPr>
@@ -286,9 +314,7 @@
             <w:pPr>
               <w:pStyle w:val="TableContents"/>
               <w:widowControl w:val="false"/>
-              <w:rPr>
-                <w:rFonts w:ascii="Arial" w:hAnsi="Arial"/>
-              </w:rPr>
+              <w:rPr/>
             </w:pPr>
             <w:r>
               <w:rPr>
@@ -348,9 +374,7 @@
             <w:pPr>
               <w:pStyle w:val="TableContents"/>
               <w:widowControl w:val="false"/>
-              <w:rPr>
-                <w:rFonts w:ascii="Arial" w:hAnsi="Arial"/>
-              </w:rPr>
+              <w:rPr/>
             </w:pPr>
             <w:r>
               <w:rPr>
@@ -477,9 +501,7 @@
               <w:suppressAutoHyphens w:val="true"/>
               <w:spacing w:before="0" w:after="0"/>
               <w:ind w:hanging="0" w:right="176"/>
-              <w:rPr>
-                <w:rFonts w:ascii="Arial" w:hAnsi="Arial"/>
-              </w:rPr>
+              <w:rPr/>
             </w:pPr>
             <w:r>
               <w:rPr>
@@ -539,9 +561,7 @@
               <w:suppressAutoHyphens w:val="true"/>
               <w:spacing w:before="0" w:after="0"/>
               <w:ind w:hanging="0" w:right="176"/>
-              <w:rPr>
-                <w:rFonts w:ascii="Arial" w:hAnsi="Arial"/>
-              </w:rPr>
+              <w:rPr/>
             </w:pPr>
             <w:r>
               <w:rPr>
@@ -570,9 +590,7 @@
             <w:pPr>
               <w:pStyle w:val="TableContents"/>
               <w:widowControl w:val="false"/>
-              <w:rPr>
-                <w:rFonts w:ascii="Arial" w:hAnsi="Arial"/>
-              </w:rPr>
+              <w:rPr/>
             </w:pPr>
             <w:r>
               <w:rPr>
@@ -629,9 +647,7 @@
             <w:pPr>
               <w:pStyle w:val="TableContents"/>
               <w:widowControl w:val="false"/>
-              <w:rPr>
-                <w:rFonts w:ascii="Arial" w:hAnsi="Arial"/>
-              </w:rPr>
+              <w:rPr/>
             </w:pPr>
             <w:r>
               <w:rPr>
@@ -759,9 +775,7 @@
               <w:suppressAutoHyphens w:val="true"/>
               <w:spacing w:before="0" w:after="0"/>
               <w:ind w:hanging="0" w:right="176"/>
-              <w:rPr>
-                <w:rFonts w:ascii="Arial" w:hAnsi="Arial"/>
-              </w:rPr>
+              <w:rPr/>
             </w:pPr>
             <w:r>
               <w:rPr>
@@ -821,9 +835,7 @@
               <w:suppressAutoHyphens w:val="true"/>
               <w:spacing w:before="0" w:after="0"/>
               <w:ind w:hanging="0" w:right="176"/>
-              <w:rPr>
-                <w:rFonts w:ascii="Arial" w:hAnsi="Arial"/>
-              </w:rPr>
+              <w:rPr/>
             </w:pPr>
             <w:r>
               <w:rPr>
@@ -855,9 +867,7 @@
               <w:suppressAutoHyphens w:val="true"/>
               <w:spacing w:before="0" w:after="0"/>
               <w:ind w:hanging="0" w:right="176"/>
-              <w:rPr>
-                <w:rFonts w:ascii="Arial" w:hAnsi="Arial"/>
-              </w:rPr>
+              <w:rPr/>
             </w:pPr>
             <w:r>
               <w:rPr>
@@ -945,9 +955,7 @@
               <w:suppressAutoHyphens w:val="true"/>
               <w:spacing w:before="0" w:after="0"/>
               <w:ind w:hanging="0" w:right="176"/>
-              <w:rPr>
-                <w:rFonts w:ascii="Arial" w:hAnsi="Arial"/>
-              </w:rPr>
+              <w:rPr/>
             </w:pPr>
             <w:r>
               <w:rPr>
@@ -1075,9 +1083,7 @@
               <w:suppressAutoHyphens w:val="true"/>
               <w:spacing w:before="0" w:after="0"/>
               <w:ind w:hanging="0" w:right="176"/>
-              <w:rPr>
-                <w:rFonts w:ascii="Arial" w:hAnsi="Arial"/>
-              </w:rPr>
+              <w:rPr/>
             </w:pPr>
             <w:r>
               <w:rPr>
@@ -1141,9 +1147,7 @@
               <w:suppressAutoHyphens w:val="true"/>
               <w:spacing w:before="0" w:after="0"/>
               <w:ind w:hanging="0" w:right="176"/>
-              <w:rPr>
-                <w:rFonts w:ascii="Arial" w:hAnsi="Arial"/>
-              </w:rPr>
+              <w:rPr/>
             </w:pPr>
             <w:r>
               <w:rPr>
@@ -1179,9 +1183,7 @@
               <w:suppressAutoHyphens w:val="true"/>
               <w:spacing w:before="0" w:after="0"/>
               <w:ind w:hanging="0" w:right="176"/>
-              <w:rPr>
-                <w:rFonts w:ascii="Arial" w:hAnsi="Arial"/>
-              </w:rPr>
+              <w:rPr/>
             </w:pPr>
             <w:r>
               <w:rPr>
@@ -1245,9 +1247,7 @@
               <w:suppressAutoHyphens w:val="true"/>
               <w:spacing w:before="0" w:after="0"/>
               <w:ind w:hanging="0" w:right="176"/>
-              <w:rPr>
-                <w:rFonts w:ascii="Arial" w:hAnsi="Arial"/>
-              </w:rPr>
+              <w:rPr/>
             </w:pPr>
             <w:r>
               <w:rPr>
@@ -1377,9 +1377,7 @@
               <w:suppressAutoHyphens w:val="true"/>
               <w:spacing w:before="0" w:after="0"/>
               <w:ind w:hanging="0" w:right="176"/>
-              <w:rPr>
-                <w:rFonts w:ascii="Arial" w:hAnsi="Arial"/>
-              </w:rPr>
+              <w:rPr/>
             </w:pPr>
             <w:r>
               <w:rPr>
@@ -1469,9 +1467,7 @@
               <w:suppressAutoHyphens w:val="true"/>
               <w:spacing w:before="0" w:after="0"/>
               <w:ind w:hanging="0" w:right="176"/>
-              <w:rPr>
-                <w:rFonts w:ascii="Arial" w:hAnsi="Arial"/>
-              </w:rPr>
+              <w:rPr/>
             </w:pPr>
             <w:r>
               <w:rPr>
@@ -1559,61 +1555,7 @@
           <w:szCs w:val="18"/>
           <w:lang w:val="fr-CH"/>
         </w:rPr>
-        <w:t>{% if situationsplan %}{{ "situationsplan" | image(1</w:t>
-      </w:r>
-      <w:r>
-        <w:rPr>
-          <w:rFonts w:ascii="Arial" w:hAnsi="Arial"/>
-          <w:sz w:val="18"/>
-          <w:szCs w:val="18"/>
-          <w:lang w:val="fr-CH"/>
-        </w:rPr>
-        <w:t>56</w:t>
-      </w:r>
-      <w:r>
-        <w:rPr>
-          <w:rFonts w:ascii="Arial" w:hAnsi="Arial"/>
-          <w:sz w:val="18"/>
-          <w:szCs w:val="18"/>
-          <w:lang w:val="fr-CH"/>
-        </w:rPr>
-        <w:t xml:space="preserve">, </w:t>
-      </w:r>
-      <w:r>
-        <w:rPr>
-          <w:rFonts w:ascii="Arial" w:hAnsi="Arial"/>
-          <w:sz w:val="18"/>
-          <w:szCs w:val="18"/>
-          <w:lang w:val="fr-CH"/>
-        </w:rPr>
-        <w:t>88</w:t>
-      </w:r>
-      <w:r>
-        <w:rPr>
-          <w:rFonts w:ascii="Arial" w:hAnsi="Arial"/>
-          <w:sz w:val="18"/>
-          <w:szCs w:val="18"/>
-          <w:lang w:val="fr-CH"/>
-        </w:rPr>
-        <w:t xml:space="preserve">, </w:t>
-      </w:r>
-      <w:r>
-        <w:rPr>
-          <w:rFonts w:ascii="Arial" w:hAnsi="Arial"/>
-          <w:sz w:val="18"/>
-          <w:szCs w:val="18"/>
-          <w:lang w:val="fr-CH"/>
-        </w:rPr>
-        <w:t>False</w:t>
-      </w:r>
-      <w:r>
-        <w:rPr>
-          <w:rFonts w:ascii="Arial" w:hAnsi="Arial"/>
-          <w:sz w:val="18"/>
-          <w:szCs w:val="18"/>
-          <w:lang w:val="fr-CH"/>
-        </w:rPr>
-        <w:t>) }}{% endif %}</w:t>
+        <w:t>{% if situationsplan %}{{ "situationsplan" | image(156, 88, False) }}{% endif %}</w:t>
       </w:r>
     </w:p>
     <w:p>
@@ -1628,7 +1570,9 @@
       </w:pPr>
       <w:r>
         <w:rPr>
-          <w:rFonts w:ascii="Arial" w:hAnsi="Arial"/>
+          <w:sz w:val="18"/>
+          <w:szCs w:val="18"/>
+          <w:lang w:val="fr-CH"/>
         </w:rPr>
       </w:r>
     </w:p>
@@ -1654,6 +1598,7 @@
     <w:p>
       <w:pPr>
         <w:pStyle w:val="Normal"/>
+        <w:spacing w:before="0" w:after="0"/>
         <w:jc w:val="right"/>
         <w:rPr/>
       </w:pPr>
@@ -2430,6 +2375,48 @@
                 <w:szCs w:val="18"/>
                 <w:lang w:val="fr-CH"/>
               </w:rPr>
+              <w:t>{%p elif subSection.type == "CalculatedFloatQuestion" %}</w:t>
+            </w:r>
+          </w:p>
+          <w:p>
+            <w:pPr>
+              <w:pStyle w:val="Normal"/>
+              <w:widowControl w:val="false"/>
+              <w:suppressAutoHyphens w:val="true"/>
+              <w:jc w:val="left"/>
+              <w:rPr>
+                <w:rFonts w:ascii="Arial" w:hAnsi="Arial"/>
+              </w:rPr>
+            </w:pPr>
+            <w:r>
+              <w:rPr>
+                <w:rFonts w:cs="Arial" w:ascii="Arial" w:hAnsi="Arial"/>
+                <w:color w:val="auto"/>
+                <w:sz w:val="18"/>
+                <w:szCs w:val="18"/>
+                <w:lang w:val="fr-CH"/>
+              </w:rPr>
+              <w:t>{{ subSection.value | emptystring }}</w:t>
+            </w:r>
+          </w:p>
+          <w:p>
+            <w:pPr>
+              <w:pStyle w:val="Normal"/>
+              <w:widowControl w:val="false"/>
+              <w:suppressAutoHyphens w:val="true"/>
+              <w:jc w:val="left"/>
+              <w:rPr>
+                <w:rFonts w:ascii="Arial" w:hAnsi="Arial"/>
+              </w:rPr>
+            </w:pPr>
+            <w:r>
+              <w:rPr>
+                <w:rFonts w:cs="Arial" w:ascii="Arial" w:hAnsi="Arial"/>
+                <w:color w:val="auto"/>
+                <w:sz w:val="18"/>
+                <w:szCs w:val="18"/>
+                <w:lang w:val="fr-CH"/>
+              </w:rPr>
               <w:t>{%p elif subSection.type == "ChoiceQuestion" %}</w:t>
             </w:r>
           </w:p>
@@ -2510,7 +2497,6 @@
                           <a:prstGeom prst="rect">
                             <a:avLst/>
                           </a:prstGeom>
-                          <a:noFill/>
                         </pic:spPr>
                       </pic:pic>
                     </a:graphicData>
@@ -2563,7 +2549,6 @@
                           <a:prstGeom prst="rect">
                             <a:avLst/>
                           </a:prstGeom>
-                          <a:noFill/>
                         </pic:spPr>
                       </pic:pic>
                     </a:graphicData>
@@ -2703,7 +2688,6 @@
                           <a:prstGeom prst="rect">
                             <a:avLst/>
                           </a:prstGeom>
-                          <a:noFill/>
                         </pic:spPr>
                       </pic:pic>
                     </a:graphicData>
@@ -2756,7 +2740,6 @@
                           <a:prstGeom prst="rect">
                             <a:avLst/>
                           </a:prstGeom>
-                          <a:noFill/>
                         </pic:spPr>
                       </pic:pic>
                     </a:graphicData>
@@ -3903,6 +3886,48 @@
             <w:r>
               <w:rPr>
                 <w:rFonts w:cs="Arial" w:ascii="Arial" w:hAnsi="Arial"/>
+                <w:color w:val="auto"/>
+                <w:sz w:val="18"/>
+                <w:szCs w:val="18"/>
+                <w:lang w:val="fr-CH"/>
+              </w:rPr>
+              <w:t>{%p elif question.type == "CalculatedFloatQuestion" %}</w:t>
+            </w:r>
+          </w:p>
+          <w:p>
+            <w:pPr>
+              <w:pStyle w:val="Normal"/>
+              <w:widowControl w:val="false"/>
+              <w:suppressAutoHyphens w:val="true"/>
+              <w:jc w:val="left"/>
+              <w:rPr>
+                <w:rFonts w:ascii="Arial" w:hAnsi="Arial"/>
+              </w:rPr>
+            </w:pPr>
+            <w:r>
+              <w:rPr>
+                <w:rFonts w:cs="Arial" w:ascii="Arial" w:hAnsi="Arial"/>
+                <w:color w:val="auto"/>
+                <w:sz w:val="18"/>
+                <w:szCs w:val="18"/>
+                <w:lang w:val="fr-CH"/>
+              </w:rPr>
+              <w:t>{{ question.value | emptystring }}</w:t>
+            </w:r>
+          </w:p>
+          <w:p>
+            <w:pPr>
+              <w:pStyle w:val="Normal"/>
+              <w:widowControl w:val="false"/>
+              <w:suppressAutoHyphens w:val="true"/>
+              <w:jc w:val="left"/>
+              <w:rPr>
+                <w:rFonts w:ascii="Arial" w:hAnsi="Arial"/>
+              </w:rPr>
+            </w:pPr>
+            <w:r>
+              <w:rPr>
+                <w:rFonts w:cs="Arial" w:ascii="Arial" w:hAnsi="Arial"/>
                 <w:sz w:val="18"/>
                 <w:szCs w:val="18"/>
                 <w:lang w:val="fr-CH"/>
@@ -3985,7 +4010,6 @@
                           <a:prstGeom prst="rect">
                             <a:avLst/>
                           </a:prstGeom>
-                          <a:noFill/>
                         </pic:spPr>
                       </pic:pic>
                     </a:graphicData>
@@ -4037,7 +4061,6 @@
                           <a:prstGeom prst="rect">
                             <a:avLst/>
                           </a:prstGeom>
-                          <a:noFill/>
                         </pic:spPr>
                       </pic:pic>
                     </a:graphicData>
@@ -4172,7 +4195,6 @@
                           <a:prstGeom prst="rect">
                             <a:avLst/>
                           </a:prstGeom>
-                          <a:noFill/>
                         </pic:spPr>
                       </pic:pic>
                     </a:graphicData>
@@ -4224,7 +4246,6 @@
                           <a:prstGeom prst="rect">
                             <a:avLst/>
                           </a:prstGeom>
-                          <a:noFill/>
                         </pic:spPr>
                       </pic:pic>
                     </a:graphicData>
@@ -5044,7 +5065,6 @@
                           <a:prstGeom prst="rect">
                             <a:avLst/>
                           </a:prstGeom>
-                          <a:noFill/>
                         </pic:spPr>
                       </pic:pic>
                     </a:graphicData>
@@ -5096,7 +5116,6 @@
                           <a:prstGeom prst="rect">
                             <a:avLst/>
                           </a:prstGeom>
-                          <a:noFill/>
                         </pic:spPr>
                       </pic:pic>
                     </a:graphicData>
@@ -5259,7 +5278,7 @@
 </file>
 
 <file path=word/footer1.xml><?xml version="1.0" encoding="utf-8"?>
-<w:ftr xmlns:o="urn:schemas-microsoft-com:office:office" xmlns:r="http://schemas.openxmlformats.org/officeDocument/2006/relationships" xmlns:v="urn:schemas-microsoft-com:vml" xmlns:w="http://schemas.openxmlformats.org/wordprocessingml/2006/main" xmlns:w10="urn:schemas-microsoft-com:office:word" xmlns:wp="http://schemas.openxmlformats.org/drawingml/2006/wordprocessingDrawing" xmlns:pic="http://schemas.openxmlformats.org/drawingml/2006/picture" xmlns:wps="http://schemas.microsoft.com/office/word/2010/wordprocessingShape" xmlns:wpg="http://schemas.microsoft.com/office/word/2010/wordprocessingGroup" xmlns:mc="http://schemas.openxmlformats.org/markup-compatibility/2006" xmlns:wp14="http://schemas.microsoft.com/office/word/2010/wordprocessingDrawing" xmlns:w14="http://schemas.microsoft.com/office/word/2010/wordml" xmlns:w15="http://schemas.microsoft.com/office/word/2012/wordml" mc:Ignorable="w14 wp14 w15">
+<w:ftr xmlns:o="urn:schemas-microsoft-com:office:office" xmlns:r="http://schemas.openxmlformats.org/officeDocument/2006/relationships" xmlns:v="urn:schemas-microsoft-com:vml" xmlns:w="http://schemas.openxmlformats.org/wordprocessingml/2006/main" xmlns:w10="urn:schemas-microsoft-com:office:word" xmlns:wp="http://schemas.openxmlformats.org/drawingml/2006/wordprocessingDrawing" xmlns:wps="http://schemas.microsoft.com/office/word/2010/wordprocessingShape" xmlns:wpg="http://schemas.microsoft.com/office/word/2010/wordprocessingGroup" xmlns:mc="http://schemas.openxmlformats.org/markup-compatibility/2006" xmlns:wp14="http://schemas.microsoft.com/office/word/2010/wordprocessingDrawing" xmlns:w14="http://schemas.microsoft.com/office/word/2010/wordml" xmlns:w15="http://schemas.microsoft.com/office/word/2012/wordml" mc:Ignorable="w14 wp14 w15">
   <w:p>
     <w:pPr>
       <w:pStyle w:val="Footer"/>
@@ -5273,7 +5292,7 @@
 </file>
 
 <file path=word/footer2.xml><?xml version="1.0" encoding="utf-8"?>
-<w:ftr xmlns:o="urn:schemas-microsoft-com:office:office" xmlns:r="http://schemas.openxmlformats.org/officeDocument/2006/relationships" xmlns:v="urn:schemas-microsoft-com:vml" xmlns:w="http://schemas.openxmlformats.org/wordprocessingml/2006/main" xmlns:w10="urn:schemas-microsoft-com:office:word" xmlns:wp="http://schemas.openxmlformats.org/drawingml/2006/wordprocessingDrawing" xmlns:pic="http://schemas.openxmlformats.org/drawingml/2006/picture" xmlns:wps="http://schemas.microsoft.com/office/word/2010/wordprocessingShape" xmlns:wpg="http://schemas.microsoft.com/office/word/2010/wordprocessingGroup" xmlns:mc="http://schemas.openxmlformats.org/markup-compatibility/2006" xmlns:wp14="http://schemas.microsoft.com/office/word/2010/wordprocessingDrawing" xmlns:w14="http://schemas.microsoft.com/office/word/2010/wordml" xmlns:w15="http://schemas.microsoft.com/office/word/2012/wordml" mc:Ignorable="w14 wp14 w15">
+<w:ftr xmlns:o="urn:schemas-microsoft-com:office:office" xmlns:r="http://schemas.openxmlformats.org/officeDocument/2006/relationships" xmlns:v="urn:schemas-microsoft-com:vml" xmlns:w="http://schemas.openxmlformats.org/wordprocessingml/2006/main" xmlns:w10="urn:schemas-microsoft-com:office:word" xmlns:wp="http://schemas.openxmlformats.org/drawingml/2006/wordprocessingDrawing" xmlns:wps="http://schemas.microsoft.com/office/word/2010/wordprocessingShape" xmlns:wpg="http://schemas.microsoft.com/office/word/2010/wordprocessingGroup" xmlns:mc="http://schemas.openxmlformats.org/markup-compatibility/2006" xmlns:wp14="http://schemas.microsoft.com/office/word/2010/wordprocessingDrawing" xmlns:w14="http://schemas.microsoft.com/office/word/2010/wordml" xmlns:w15="http://schemas.microsoft.com/office/word/2012/wordml" mc:Ignorable="w14 wp14 w15">
   <w:p>
     <w:pPr>
       <w:pStyle w:val="Footer"/>
@@ -5388,7 +5407,7 @@
 </file>
 
 <file path=word/footer3.xml><?xml version="1.0" encoding="utf-8"?>
-<w:ftr xmlns:o="urn:schemas-microsoft-com:office:office" xmlns:r="http://schemas.openxmlformats.org/officeDocument/2006/relationships" xmlns:v="urn:schemas-microsoft-com:vml" xmlns:w="http://schemas.openxmlformats.org/wordprocessingml/2006/main" xmlns:w10="urn:schemas-microsoft-com:office:word" xmlns:wp="http://schemas.openxmlformats.org/drawingml/2006/wordprocessingDrawing" xmlns:pic="http://schemas.openxmlformats.org/drawingml/2006/picture" xmlns:wps="http://schemas.microsoft.com/office/word/2010/wordprocessingShape" xmlns:wpg="http://schemas.microsoft.com/office/word/2010/wordprocessingGroup" xmlns:mc="http://schemas.openxmlformats.org/markup-compatibility/2006" xmlns:wp14="http://schemas.microsoft.com/office/word/2010/wordprocessingDrawing" xmlns:w14="http://schemas.microsoft.com/office/word/2010/wordml" xmlns:w15="http://schemas.microsoft.com/office/word/2012/wordml" mc:Ignorable="w14 wp14 w15">
+<w:ftr xmlns:o="urn:schemas-microsoft-com:office:office" xmlns:r="http://schemas.openxmlformats.org/officeDocument/2006/relationships" xmlns:v="urn:schemas-microsoft-com:vml" xmlns:w="http://schemas.openxmlformats.org/wordprocessingml/2006/main" xmlns:w10="urn:schemas-microsoft-com:office:word" xmlns:wp="http://schemas.openxmlformats.org/drawingml/2006/wordprocessingDrawing" xmlns:wps="http://schemas.microsoft.com/office/word/2010/wordprocessingShape" xmlns:wpg="http://schemas.microsoft.com/office/word/2010/wordprocessingGroup" xmlns:mc="http://schemas.openxmlformats.org/markup-compatibility/2006" xmlns:wp14="http://schemas.microsoft.com/office/word/2010/wordprocessingDrawing" xmlns:w14="http://schemas.microsoft.com/office/word/2010/wordml" xmlns:w15="http://schemas.microsoft.com/office/word/2012/wordml" mc:Ignorable="w14 wp14 w15">
   <w:p>
     <w:pPr>
       <w:pStyle w:val="Footer"/>
@@ -5503,7 +5522,7 @@
 </file>
 
 <file path=word/header1.xml><?xml version="1.0" encoding="utf-8"?>
-<w:hdr xmlns:o="urn:schemas-microsoft-com:office:office" xmlns:r="http://schemas.openxmlformats.org/officeDocument/2006/relationships" xmlns:v="urn:schemas-microsoft-com:vml" xmlns:w="http://schemas.openxmlformats.org/wordprocessingml/2006/main" xmlns:w10="urn:schemas-microsoft-com:office:word" xmlns:wp="http://schemas.openxmlformats.org/drawingml/2006/wordprocessingDrawing" xmlns:pic="http://schemas.openxmlformats.org/drawingml/2006/picture" xmlns:wps="http://schemas.microsoft.com/office/word/2010/wordprocessingShape" xmlns:wpg="http://schemas.microsoft.com/office/word/2010/wordprocessingGroup" xmlns:mc="http://schemas.openxmlformats.org/markup-compatibility/2006" xmlns:wp14="http://schemas.microsoft.com/office/word/2010/wordprocessingDrawing" xmlns:w14="http://schemas.microsoft.com/office/word/2010/wordml" xmlns:w15="http://schemas.microsoft.com/office/word/2012/wordml" mc:Ignorable="w14 wp14 w15">
+<w:hdr xmlns:o="urn:schemas-microsoft-com:office:office" xmlns:r="http://schemas.openxmlformats.org/officeDocument/2006/relationships" xmlns:v="urn:schemas-microsoft-com:vml" xmlns:w="http://schemas.openxmlformats.org/wordprocessingml/2006/main" xmlns:w10="urn:schemas-microsoft-com:office:word" xmlns:wp="http://schemas.openxmlformats.org/drawingml/2006/wordprocessingDrawing" xmlns:wps="http://schemas.microsoft.com/office/word/2010/wordprocessingShape" xmlns:wpg="http://schemas.microsoft.com/office/word/2010/wordprocessingGroup" xmlns:mc="http://schemas.openxmlformats.org/markup-compatibility/2006" xmlns:wp14="http://schemas.microsoft.com/office/word/2010/wordprocessingDrawing" xmlns:w14="http://schemas.microsoft.com/office/word/2010/wordml" xmlns:w15="http://schemas.microsoft.com/office/word/2012/wordml" mc:Ignorable="w14 wp14 w15">
   <w:p>
     <w:pPr>
       <w:pStyle w:val="Header"/>
@@ -5517,7 +5536,7 @@
 </file>
 
 <file path=word/header2.xml><?xml version="1.0" encoding="utf-8"?>
-<w:hdr xmlns:o="urn:schemas-microsoft-com:office:office" xmlns:r="http://schemas.openxmlformats.org/officeDocument/2006/relationships" xmlns:v="urn:schemas-microsoft-com:vml" xmlns:w="http://schemas.openxmlformats.org/wordprocessingml/2006/main" xmlns:w10="urn:schemas-microsoft-com:office:word" xmlns:wp="http://schemas.openxmlformats.org/drawingml/2006/wordprocessingDrawing" xmlns:pic="http://schemas.openxmlformats.org/drawingml/2006/picture" xmlns:wps="http://schemas.microsoft.com/office/word/2010/wordprocessingShape" xmlns:wpg="http://schemas.microsoft.com/office/word/2010/wordprocessingGroup" xmlns:mc="http://schemas.openxmlformats.org/markup-compatibility/2006" xmlns:wp14="http://schemas.microsoft.com/office/word/2010/wordprocessingDrawing" xmlns:w14="http://schemas.microsoft.com/office/word/2010/wordml" xmlns:w15="http://schemas.microsoft.com/office/word/2012/wordml" mc:Ignorable="w14 wp14 w15">
+<w:hdr xmlns:o="urn:schemas-microsoft-com:office:office" xmlns:r="http://schemas.openxmlformats.org/officeDocument/2006/relationships" xmlns:v="urn:schemas-microsoft-com:vml" xmlns:w="http://schemas.openxmlformats.org/wordprocessingml/2006/main" xmlns:w10="urn:schemas-microsoft-com:office:word" xmlns:wp="http://schemas.openxmlformats.org/drawingml/2006/wordprocessingDrawing" xmlns:wps="http://schemas.microsoft.com/office/word/2010/wordprocessingShape" xmlns:wpg="http://schemas.microsoft.com/office/word/2010/wordprocessingGroup" xmlns:mc="http://schemas.openxmlformats.org/markup-compatibility/2006" xmlns:wp14="http://schemas.microsoft.com/office/word/2010/wordprocessingDrawing" xmlns:w14="http://schemas.microsoft.com/office/word/2010/wordml" xmlns:w15="http://schemas.microsoft.com/office/word/2012/wordml" mc:Ignorable="w14 wp14 w15">
   <w:p>
     <w:pPr>
       <w:pStyle w:val="Header"/>
@@ -5531,7 +5550,7 @@
 </file>
 
 <file path=word/header3.xml><?xml version="1.0" encoding="utf-8"?>
-<w:hdr xmlns:o="urn:schemas-microsoft-com:office:office" xmlns:r="http://schemas.openxmlformats.org/officeDocument/2006/relationships" xmlns:v="urn:schemas-microsoft-com:vml" xmlns:w="http://schemas.openxmlformats.org/wordprocessingml/2006/main" xmlns:w10="urn:schemas-microsoft-com:office:word" xmlns:wp="http://schemas.openxmlformats.org/drawingml/2006/wordprocessingDrawing" xmlns:pic="http://schemas.openxmlformats.org/drawingml/2006/picture" xmlns:wps="http://schemas.microsoft.com/office/word/2010/wordprocessingShape" xmlns:wpg="http://schemas.microsoft.com/office/word/2010/wordprocessingGroup" xmlns:mc="http://schemas.openxmlformats.org/markup-compatibility/2006" xmlns:wp14="http://schemas.microsoft.com/office/word/2010/wordprocessingDrawing" xmlns:w14="http://schemas.microsoft.com/office/word/2010/wordml" xmlns:w15="http://schemas.microsoft.com/office/word/2012/wordml" mc:Ignorable="w14 wp14 w15">
+<w:hdr xmlns:o="urn:schemas-microsoft-com:office:office" xmlns:r="http://schemas.openxmlformats.org/officeDocument/2006/relationships" xmlns:v="urn:schemas-microsoft-com:vml" xmlns:w="http://schemas.openxmlformats.org/wordprocessingml/2006/main" xmlns:w10="urn:schemas-microsoft-com:office:word" xmlns:wp="http://schemas.openxmlformats.org/drawingml/2006/wordprocessingDrawing" xmlns:wps="http://schemas.microsoft.com/office/word/2010/wordprocessingShape" xmlns:wpg="http://schemas.microsoft.com/office/word/2010/wordprocessingGroup" xmlns:mc="http://schemas.openxmlformats.org/markup-compatibility/2006" xmlns:wp14="http://schemas.microsoft.com/office/word/2010/wordprocessingDrawing" xmlns:w14="http://schemas.microsoft.com/office/word/2010/wordml" xmlns:w15="http://schemas.microsoft.com/office/word/2012/wordml" mc:Ignorable="w14 wp14 w15">
   <w:p>
     <w:pPr>
       <w:pStyle w:val="Header"/>
@@ -6240,7 +6259,7 @@
     </w:rPr>
   </w:style>
   <w:style w:type="paragraph" w:styleId="Heading1">
-    <w:name w:val="heading 1"/>
+    <w:name w:val="Heading 1"/>
     <w:basedOn w:val="Normal"/>
     <w:qFormat/>
     <w:pPr>
@@ -6262,7 +6281,7 @@
     </w:rPr>
   </w:style>
   <w:style w:type="paragraph" w:styleId="Heading2">
-    <w:name w:val="heading 2"/>
+    <w:name w:val="Heading 2"/>
     <w:basedOn w:val="Normal"/>
     <w:qFormat/>
     <w:pPr>
@@ -6284,7 +6303,7 @@
     </w:rPr>
   </w:style>
   <w:style w:type="paragraph" w:styleId="Heading3">
-    <w:name w:val="heading 3"/>
+    <w:name w:val="Heading 3"/>
     <w:basedOn w:val="Normal"/>
     <w:qFormat/>
     <w:pPr>
@@ -6381,7 +6400,7 @@
     <w:rPr/>
   </w:style>
   <w:style w:type="paragraph" w:styleId="Caption">
-    <w:name w:val="caption"/>
+    <w:name w:val="Caption"/>
     <w:basedOn w:val="Normal"/>
     <w:qFormat/>
     <w:pPr>
@@ -6472,7 +6491,7 @@
     <w:rPr/>
   </w:style>
   <w:style w:type="paragraph" w:styleId="Header">
-    <w:name w:val="header"/>
+    <w:name w:val="Header"/>
     <w:basedOn w:val="Normal"/>
     <w:link w:val="KopfzeileZchn"/>
     <w:uiPriority w:val="99"/>
@@ -6491,7 +6510,7 @@
     </w:rPr>
   </w:style>
   <w:style w:type="paragraph" w:styleId="Footer">
-    <w:name w:val="footer"/>
+    <w:name w:val="Footer"/>
     <w:basedOn w:val="Normal"/>
     <w:link w:val="FuzeileZchn"/>
     <w:uiPriority w:val="99"/>
@@ -6547,8 +6566,8 @@
       <w:bCs/>
     </w:rPr>
   </w:style>
-  <w:style w:type="paragraph" w:styleId="FrameContentsuser">
-    <w:name w:val="Frame Contents (user)"/>
+  <w:style w:type="paragraph" w:styleId="FrameContents">
+    <w:name w:val="Frame Contents"/>
     <w:basedOn w:val="Normal"/>
     <w:qFormat/>
     <w:pPr/>

</xml_diff>

<commit_message>
feat(gr): hide the documents from the pdf export
</commit_message>
<xml_diff>
--- a/document-merge-service/kt_gr/templatefiles/form.docx
+++ b/document-merge-service/kt_gr/templatefiles/form.docx
@@ -12,10 +12,9 @@
         <w:ind w:hanging="0" w:left="4229" w:right="0"/>
         <w:jc w:val="left"/>
         <w:rPr>
-          <w:b/>
-          <w:bCs/>
-          <w:strike/>
-          <w:u w:val="single"/>
+          <w:strike w:val="false"/>
+          <w:dstrike w:val="false"/>
+          <w:u w:val="none"/>
         </w:rPr>
       </w:pPr>
       <w:r>
@@ -23,10 +22,11 @@
           <w:rFonts w:cs="Arial" w:ascii="Arial" w:hAnsi="Arial"/>
           <w:b/>
           <w:bCs/>
-          <w:strike/>
+          <w:strike w:val="false"/>
+          <w:dstrike w:val="false"/>
           <w:sz w:val="48"/>
           <w:szCs w:val="44"/>
-          <w:u w:val="single"/>
+          <w:u w:val="none"/>
           <w:lang w:val="fr-CH"/>
         </w:rPr>
         <w:t>{{ caseType }}</w:t>
@@ -38,12 +38,13 @@
           <w:rFonts w:eastAsia="Noto Sans CJK SC Regular" w:cs="Arial" w:ascii="Arial" w:hAnsi="Arial"/>
           <w:b/>
           <w:bCs/>
-          <w:strike/>
+          <w:strike w:val="false"/>
+          <w:dstrike w:val="false"/>
           <w:color w:val="auto"/>
           <w:kern w:val="2"/>
           <w:sz w:val="48"/>
           <w:szCs w:val="44"/>
-          <w:u w:val="single"/>
+          <w:u w:val="none"/>
           <w:lang w:val="fr-CH" w:eastAsia="zh-CN" w:bidi="hi-IN"/>
         </w:rPr>
         <w:t>dossierNr</w:t>
@@ -53,10 +54,11 @@
           <w:rFonts w:cs="Arial" w:ascii="Arial" w:hAnsi="Arial"/>
           <w:b/>
           <w:bCs/>
-          <w:strike/>
+          <w:strike w:val="false"/>
+          <w:dstrike w:val="false"/>
           <w:sz w:val="48"/>
           <w:szCs w:val="44"/>
-          <w:u w:val="single"/>
+          <w:u w:val="none"/>
           <w:lang w:val="fr-CH"/>
         </w:rPr>
         <w:t xml:space="preserve"> }}</w:t>
@@ -67,11 +69,12 @@
           <w:rFonts w:cs="Arial" w:ascii="Arial" w:hAnsi="Arial"/>
           <w:b/>
           <w:bCs/>
-          <w:strike/>
+          <w:strike w:val="false"/>
+          <w:dstrike w:val="false"/>
           <w:color w:val="808080"/>
           <w:sz w:val="32"/>
           <w:szCs w:val="32"/>
-          <w:u w:val="single"/>
+          <w:u w:val="none"/>
           <w:lang w:val="fr-CH"/>
         </w:rPr>
         <w:t>{% if formType %}{{ formType }}</w:t>
@@ -83,16 +86,15 @@
       <w:pPr>
         <w:pStyle w:val="FrameContents"/>
         <w:suppressAutoHyphens w:val="true"/>
-        <w:overflowPunct w:val="false"/>
+        <w:overflowPunct w:val="true"/>
         <w:bidi w:val="0"/>
         <w:spacing w:before="114" w:after="114"/>
         <w:ind w:hanging="0" w:left="4229" w:right="0"/>
         <w:jc w:val="left"/>
         <w:rPr>
-          <w:b/>
-          <w:bCs/>
-          <w:strike/>
-          <w:u w:val="single"/>
+          <w:strike w:val="false"/>
+          <w:dstrike w:val="false"/>
+          <w:u w:val="none"/>
         </w:rPr>
       </w:pPr>
       <w:r>
@@ -100,11 +102,12 @@
           <w:rFonts w:cs="Arial" w:ascii="Arial" w:hAnsi="Arial"/>
           <w:b/>
           <w:bCs/>
-          <w:strike/>
+          <w:strike w:val="false"/>
+          <w:dstrike w:val="false"/>
           <w:color w:val="808080"/>
           <w:sz w:val="18"/>
           <w:szCs w:val="18"/>
-          <w:u w:val="single"/>
+          <w:u w:val="none"/>
           <w:lang w:val="fr-CH"/>
         </w:rPr>
         <w:t>{{ createdAt }}</w:t>
@@ -115,16 +118,15 @@
         <w:pStyle w:val="FrameContents"/>
         <w:widowControl w:val="false"/>
         <w:suppressAutoHyphens w:val="true"/>
-        <w:overflowPunct w:val="false"/>
+        <w:overflowPunct w:val="true"/>
         <w:bidi w:val="0"/>
         <w:spacing w:before="114" w:after="114"/>
         <w:ind w:hanging="0" w:left="4229" w:right="0"/>
         <w:jc w:val="left"/>
         <w:rPr>
-          <w:b/>
-          <w:bCs/>
-          <w:strike/>
-          <w:u w:val="single"/>
+          <w:strike w:val="false"/>
+          <w:dstrike w:val="false"/>
+          <w:u w:val="none"/>
         </w:rPr>
       </w:pPr>
       <w:r>
@@ -132,11 +134,12 @@
           <w:rFonts w:cs="Arial" w:ascii="Arial" w:hAnsi="Arial"/>
           <w:b/>
           <w:bCs/>
-          <w:strike/>
+          <w:strike w:val="false"/>
+          <w:dstrike w:val="false"/>
           <w:color w:val="808080"/>
           <w:sz w:val="18"/>
           <w:szCs w:val="18"/>
-          <w:u w:val="single"/>
+          <w:u w:val="none"/>
           <w:lang w:val="fr-CH"/>
         </w:rPr>
         <w:t>{{ modifiedAt }}</w:t>
@@ -147,16 +150,15 @@
         <w:pStyle w:val="FrameContents"/>
         <w:widowControl w:val="false"/>
         <w:suppressAutoHyphens w:val="true"/>
-        <w:overflowPunct w:val="false"/>
+        <w:overflowPunct w:val="true"/>
         <w:bidi w:val="0"/>
         <w:spacing w:before="114" w:after="114"/>
         <w:ind w:hanging="0" w:left="4229" w:right="0"/>
         <w:jc w:val="left"/>
         <w:rPr>
-          <w:b/>
-          <w:bCs/>
-          <w:strike/>
-          <w:u w:val="single"/>
+          <w:strike w:val="false"/>
+          <w:dstrike w:val="false"/>
+          <w:u w:val="none"/>
         </w:rPr>
       </w:pPr>
       <w:r>
@@ -164,11 +166,12 @@
           <w:rFonts w:cs="Arial" w:ascii="Arial" w:hAnsi="Arial"/>
           <w:b/>
           <w:bCs/>
-          <w:strike/>
+          <w:strike w:val="false"/>
+          <w:dstrike w:val="false"/>
           <w:color w:val="808080"/>
           <w:sz w:val="18"/>
           <w:szCs w:val="18"/>
-          <w:u w:val="single"/>
+          <w:u w:val="none"/>
           <w:lang w:val="fr-CH"/>
         </w:rPr>
         <w:t>{{ generatedAt }}</w:t>
@@ -1717,7 +1720,47 @@
           <w:szCs w:val="18"/>
           <w:lang w:val="fr-CH"/>
         </w:rPr>
-        <w:t>"]%}</w:t>
+        <w:t>", "</w:t>
+      </w:r>
+      <w:r>
+        <w:rPr>
+          <w:rFonts w:cs="Arial" w:ascii="Arial" w:hAnsi="Arial"/>
+          <w:color w:themeColor="accent1" w:val="4F81BD"/>
+          <w:sz w:val="18"/>
+          <w:szCs w:val="18"/>
+          <w:lang w:val="fr-CH"/>
+        </w:rPr>
+        <w:t>bestaetigung",</w:t>
+      </w:r>
+      <w:r>
+        <w:rPr>
+          <w:rFonts w:cs="Arial" w:ascii="Arial" w:hAnsi="Arial"/>
+          <w:color w:themeColor="accent1" w:val="4F81BD"/>
+          <w:sz w:val="18"/>
+          <w:szCs w:val="18"/>
+          <w:lang w:val="fr-CH"/>
+        </w:rPr>
+        <w:t xml:space="preserve"> "</w:t>
+      </w:r>
+      <w:r>
+        <w:rPr>
+          <w:rFonts w:cs="Arial" w:ascii="Arial" w:hAnsi="Arial"/>
+          <w:color w:themeColor="accent1" w:val="4F81BD"/>
+          <w:sz w:val="18"/>
+          <w:szCs w:val="18"/>
+          <w:lang w:val="fr-CH"/>
+        </w:rPr>
+        <w:t>dokumente", "dokumente-v2"</w:t>
+      </w:r>
+      <w:r>
+        <w:rPr>
+          <w:rFonts w:cs="Arial" w:ascii="Arial" w:hAnsi="Arial"/>
+          <w:color w:themeColor="accent1" w:val="4F81BD"/>
+          <w:sz w:val="18"/>
+          <w:szCs w:val="18"/>
+          <w:lang w:val="fr-CH"/>
+        </w:rPr>
+        <w:t>] %}</w:t>
       </w:r>
     </w:p>
     <w:p>
@@ -2107,7 +2150,47 @@
                 <w:szCs w:val="18"/>
                 <w:lang w:val="fr-CH"/>
               </w:rPr>
-              <w:t>"] %}</w:t>
+              <w:t>", "</w:t>
+            </w:r>
+            <w:r>
+              <w:rPr>
+                <w:rFonts w:cs="Arial" w:ascii="Arial" w:hAnsi="Arial"/>
+                <w:color w:themeColor="accent1" w:val="4F81BD"/>
+                <w:sz w:val="18"/>
+                <w:szCs w:val="18"/>
+                <w:lang w:val="fr-CH"/>
+              </w:rPr>
+              <w:t>bestaetigung",</w:t>
+            </w:r>
+            <w:r>
+              <w:rPr>
+                <w:rFonts w:cs="Arial" w:ascii="Arial" w:hAnsi="Arial"/>
+                <w:color w:themeColor="accent1" w:val="4F81BD"/>
+                <w:sz w:val="18"/>
+                <w:szCs w:val="18"/>
+                <w:lang w:val="fr-CH"/>
+              </w:rPr>
+              <w:t xml:space="preserve"> "</w:t>
+            </w:r>
+            <w:r>
+              <w:rPr>
+                <w:rFonts w:cs="Arial" w:ascii="Arial" w:hAnsi="Arial"/>
+                <w:color w:themeColor="accent1" w:val="4F81BD"/>
+                <w:sz w:val="18"/>
+                <w:szCs w:val="18"/>
+                <w:lang w:val="fr-CH"/>
+              </w:rPr>
+              <w:t>dokumente", "dokumente-v2"</w:t>
+            </w:r>
+            <w:r>
+              <w:rPr>
+                <w:rFonts w:cs="Arial" w:ascii="Arial" w:hAnsi="Arial"/>
+                <w:color w:themeColor="accent1" w:val="4F81BD"/>
+                <w:sz w:val="18"/>
+                <w:szCs w:val="18"/>
+                <w:lang w:val="fr-CH"/>
+              </w:rPr>
+              <w:t>] %}</w:t>
             </w:r>
           </w:p>
         </w:tc>

</xml_diff>

<commit_message>
feat(gr): remove tags from the form export template
</commit_message>
<xml_diff>
--- a/document-merge-service/kt_gr/templatefiles/form.docx
+++ b/document-merge-service/kt_gr/templatefiles/form.docx
@@ -86,7 +86,7 @@
       <w:pPr>
         <w:pStyle w:val="FrameContents"/>
         <w:suppressAutoHyphens w:val="true"/>
-        <w:overflowPunct w:val="true"/>
+        <w:overflowPunct w:val="false"/>
         <w:bidi w:val="0"/>
         <w:spacing w:before="114" w:after="114"/>
         <w:ind w:hanging="0" w:left="4229" w:right="0"/>
@@ -118,7 +118,7 @@
         <w:pStyle w:val="FrameContents"/>
         <w:widowControl w:val="false"/>
         <w:suppressAutoHyphens w:val="true"/>
-        <w:overflowPunct w:val="true"/>
+        <w:overflowPunct w:val="false"/>
         <w:bidi w:val="0"/>
         <w:spacing w:before="114" w:after="114"/>
         <w:ind w:hanging="0" w:left="4229" w:right="0"/>
@@ -150,7 +150,7 @@
         <w:pStyle w:val="FrameContents"/>
         <w:widowControl w:val="false"/>
         <w:suppressAutoHyphens w:val="true"/>
-        <w:overflowPunct w:val="true"/>
+        <w:overflowPunct w:val="false"/>
         <w:bidi w:val="0"/>
         <w:spacing w:before="114" w:after="114"/>
         <w:ind w:hanging="0" w:left="4229" w:right="0"/>
@@ -564,11 +564,8 @@
               <w:suppressAutoHyphens w:val="true"/>
               <w:spacing w:before="0" w:after="0"/>
               <w:ind w:hanging="0" w:right="176"/>
-              <w:rPr/>
-            </w:pPr>
-            <w:r>
-              <w:rPr>
-                <w:rFonts w:eastAsia="Noto Sans CJK SC Regular" w:cs="Arial" w:ascii="Arial" w:hAnsi="Arial"/>
+              <w:rPr>
+                <w:rFonts w:ascii="Arial" w:hAnsi="Arial" w:eastAsia="Noto Sans CJK SC Regular" w:cs="Arial"/>
                 <w:b/>
                 <w:bCs/>
                 <w:color w:val="auto"/>
@@ -577,7 +574,9 @@
                 <w:szCs w:val="18"/>
                 <w:lang w:val="fr-CH" w:eastAsia="zh-CN" w:bidi="hi-IN"/>
               </w:rPr>
-              <w:t>{{ tagHeaderLabel }}</w:t>
+            </w:pPr>
+            <w:r>
+              <w:rPr/>
             </w:r>
           </w:p>
         </w:tc>
@@ -650,11 +649,8 @@
             <w:pPr>
               <w:pStyle w:val="TableContents"/>
               <w:widowControl w:val="false"/>
-              <w:rPr/>
-            </w:pPr>
-            <w:r>
-              <w:rPr>
-                <w:rFonts w:eastAsia="Noto Sans CJK SC Regular" w:cs="Arial" w:ascii="Arial" w:hAnsi="Arial"/>
+              <w:rPr>
+                <w:rFonts w:ascii="Arial" w:hAnsi="Arial" w:eastAsia="Noto Sans CJK SC Regular" w:cs="Arial"/>
                 <w:b w:val="false"/>
                 <w:bCs w:val="false"/>
                 <w:color w:val="auto"/>
@@ -663,7 +659,9 @@
                 <w:szCs w:val="18"/>
                 <w:lang w:val="fr-CH" w:eastAsia="zh-CN" w:bidi="hi-IN"/>
               </w:rPr>
-              <w:t>{% if tagHeader %}{{ tagHeader }}{% else %}-{% endif%}</w:t>
+            </w:pPr>
+            <w:r>
+              <w:rPr/>
             </w:r>
           </w:p>
         </w:tc>
@@ -1720,47 +1718,7 @@
           <w:szCs w:val="18"/>
           <w:lang w:val="fr-CH"/>
         </w:rPr>
-        <w:t>", "</w:t>
-      </w:r>
-      <w:r>
-        <w:rPr>
-          <w:rFonts w:cs="Arial" w:ascii="Arial" w:hAnsi="Arial"/>
-          <w:color w:themeColor="accent1" w:val="4F81BD"/>
-          <w:sz w:val="18"/>
-          <w:szCs w:val="18"/>
-          <w:lang w:val="fr-CH"/>
-        </w:rPr>
-        <w:t>bestaetigung",</w:t>
-      </w:r>
-      <w:r>
-        <w:rPr>
-          <w:rFonts w:cs="Arial" w:ascii="Arial" w:hAnsi="Arial"/>
-          <w:color w:themeColor="accent1" w:val="4F81BD"/>
-          <w:sz w:val="18"/>
-          <w:szCs w:val="18"/>
-          <w:lang w:val="fr-CH"/>
-        </w:rPr>
-        <w:t xml:space="preserve"> "</w:t>
-      </w:r>
-      <w:r>
-        <w:rPr>
-          <w:rFonts w:cs="Arial" w:ascii="Arial" w:hAnsi="Arial"/>
-          <w:color w:themeColor="accent1" w:val="4F81BD"/>
-          <w:sz w:val="18"/>
-          <w:szCs w:val="18"/>
-          <w:lang w:val="fr-CH"/>
-        </w:rPr>
-        <w:t>dokumente", "dokumente-v2"</w:t>
-      </w:r>
-      <w:r>
-        <w:rPr>
-          <w:rFonts w:cs="Arial" w:ascii="Arial" w:hAnsi="Arial"/>
-          <w:color w:themeColor="accent1" w:val="4F81BD"/>
-          <w:sz w:val="18"/>
-          <w:szCs w:val="18"/>
-          <w:lang w:val="fr-CH"/>
-        </w:rPr>
-        <w:t>] %}</w:t>
+        <w:t>", "bestaetigung", "dokumente", "dokumente-v2"] %}</w:t>
       </w:r>
     </w:p>
     <w:p>
@@ -2150,47 +2108,7 @@
                 <w:szCs w:val="18"/>
                 <w:lang w:val="fr-CH"/>
               </w:rPr>
-              <w:t>", "</w:t>
-            </w:r>
-            <w:r>
-              <w:rPr>
-                <w:rFonts w:cs="Arial" w:ascii="Arial" w:hAnsi="Arial"/>
-                <w:color w:themeColor="accent1" w:val="4F81BD"/>
-                <w:sz w:val="18"/>
-                <w:szCs w:val="18"/>
-                <w:lang w:val="fr-CH"/>
-              </w:rPr>
-              <w:t>bestaetigung",</w:t>
-            </w:r>
-            <w:r>
-              <w:rPr>
-                <w:rFonts w:cs="Arial" w:ascii="Arial" w:hAnsi="Arial"/>
-                <w:color w:themeColor="accent1" w:val="4F81BD"/>
-                <w:sz w:val="18"/>
-                <w:szCs w:val="18"/>
-                <w:lang w:val="fr-CH"/>
-              </w:rPr>
-              <w:t xml:space="preserve"> "</w:t>
-            </w:r>
-            <w:r>
-              <w:rPr>
-                <w:rFonts w:cs="Arial" w:ascii="Arial" w:hAnsi="Arial"/>
-                <w:color w:themeColor="accent1" w:val="4F81BD"/>
-                <w:sz w:val="18"/>
-                <w:szCs w:val="18"/>
-                <w:lang w:val="fr-CH"/>
-              </w:rPr>
-              <w:t>dokumente", "dokumente-v2"</w:t>
-            </w:r>
-            <w:r>
-              <w:rPr>
-                <w:rFonts w:cs="Arial" w:ascii="Arial" w:hAnsi="Arial"/>
-                <w:color w:themeColor="accent1" w:val="4F81BD"/>
-                <w:sz w:val="18"/>
-                <w:szCs w:val="18"/>
-                <w:lang w:val="fr-CH"/>
-              </w:rPr>
-              <w:t>] %}</w:t>
+              <w:t>", "bestaetigung", "dokumente", "dokumente-v2"] %}</w:t>
             </w:r>
           </w:p>
         </w:tc>

</xml_diff>